<commit_message>
feat: rebuild site with updated assets and project metadata
</commit_message>
<xml_diff>
--- a/public/assets/Shakil_Mahmud_CV.docx
+++ b/public/assets/Shakil_Mahmud_CV.docx
@@ -1,8 +1,8 @@
 
 <file path=word/document.xml><?xml version="1.0" encoding="utf-8"?>
-<w:document xmlns:mc="http://schemas.openxmlformats.org/markup-compatibility/2006" xmlns:o="urn:schemas-microsoft-com:office:office" xmlns:r="http://schemas.openxmlformats.org/officeDocument/2006/relationships" xmlns:m="http://schemas.openxmlformats.org/officeDocument/2006/math" xmlns:v="urn:schemas-microsoft-com:vml" xmlns:wp="http://schemas.openxmlformats.org/drawingml/2006/wordprocessingDrawing" xmlns:w10="urn:schemas-microsoft-com:office:word" xmlns:w="http://schemas.openxmlformats.org/wordprocessingml/2006/main" xmlns:wne="http://schemas.microsoft.com/office/word/2006/wordml" xmlns:sl="http://schemas.openxmlformats.org/schemaLibrary/2006/main" xmlns:a="http://schemas.openxmlformats.org/drawingml/2006/main" xmlns:pic="http://schemas.openxmlformats.org/drawingml/2006/picture" xmlns:c="http://schemas.openxmlformats.org/drawingml/2006/chart" xmlns:lc="http://schemas.openxmlformats.org/drawingml/2006/lockedCanvas" xmlns:dgm="http://schemas.openxmlformats.org/drawingml/2006/diagram" xmlns:wps="http://schemas.microsoft.com/office/word/2010/wordprocessingShape" xmlns:wpg="http://schemas.microsoft.com/office/word/2010/wordprocessingGroup" xmlns:w14="http://schemas.microsoft.com/office/word/2010/wordml" xmlns:w15="http://schemas.microsoft.com/office/word/2012/wordml" xmlns:w16="http://schemas.microsoft.com/office/word/2018/wordml" xmlns:w16cex="http://schemas.microsoft.com/office/word/2018/wordml/cex" xmlns:w16cid="http://schemas.microsoft.com/office/word/2016/wordml/cid" xmlns="http://schemas.microsoft.com/office/tasks/2019/documenttasks" xmlns:cr="http://schemas.microsoft.com/office/comments/2020/reactions">
+<w:document xmlns:ns1="http://schemas.microsoft.com/office/word/2010/wordml" xmlns:ns2="http://schemas.openxmlformats.org/drawingml/2006/wordprocessingDrawing" xmlns:ns3="http://schemas.openxmlformats.org/drawingml/2006/main" xmlns:ns4="http://schemas.openxmlformats.org/drawingml/2006/picture" xmlns:ns5="http://schemas.openxmlformats.org/officeDocument/2006/relationships" xmlns:ns6="http://schemas.openxmlformats.org/markup-compatibility/2006" xmlns:ns7="http://schemas.microsoft.com/office/word/2010/wordprocessingShape" xmlns:w="http://schemas.openxmlformats.org/wordprocessingml/2006/main">
   <w:body>
-    <w:p>
+    <w:p ns1:paraId="00000001">
       <w:pPr>
         <w:rPr>
           <w:rFonts w:ascii="Arial Black" w:cs="Arial Black" w:eastAsia="Arial Black" w:hAnsi="Arial Black"/>
@@ -25,90 +25,90 @@
       </w:r>
       <w:r>
         <w:drawing>
-          <wp:anchor allowOverlap="1" behindDoc="0" distB="0" distT="0" distL="114300" distR="114300" hidden="0" layoutInCell="1" locked="0" relativeHeight="0" simplePos="0">
-            <wp:simplePos x="0" y="0"/>
-            <wp:positionH relativeFrom="column">
-              <wp:posOffset>4679950</wp:posOffset>
-            </wp:positionH>
-            <wp:positionV relativeFrom="paragraph">
-              <wp:posOffset>0</wp:posOffset>
-            </wp:positionV>
-            <wp:extent cx="1307465" cy="1594485"/>
-            <wp:effectExtent b="0" l="0" r="0" t="0"/>
-            <wp:wrapSquare wrapText="bothSides" distB="0" distT="0" distL="114300" distR="114300"/>
-            <wp:docPr id="12" name="image6.jpg"/>
-            <a:graphic>
-              <a:graphicData uri="http://schemas.openxmlformats.org/drawingml/2006/picture">
-                <pic:pic>
-                  <pic:nvPicPr>
-                    <pic:cNvPr id="0" name="image6.jpg"/>
-                    <pic:cNvPicPr preferRelativeResize="0"/>
-                  </pic:nvPicPr>
-                  <pic:blipFill>
-                    <a:blip r:embed="rId6"/>
-                    <a:srcRect b="0" l="0" r="0" t="0"/>
-                    <a:stretch>
-                      <a:fillRect/>
-                    </a:stretch>
-                  </pic:blipFill>
-                  <pic:spPr>
-                    <a:xfrm>
-                      <a:off x="0" y="0"/>
-                      <a:ext cx="1307465" cy="1594485"/>
-                    </a:xfrm>
-                    <a:prstGeom prst="rect"/>
-                    <a:ln/>
-                  </pic:spPr>
-                </pic:pic>
-              </a:graphicData>
-            </a:graphic>
-          </wp:anchor>
+          <ns2:anchor allowOverlap="1" behindDoc="0" distB="0" distT="0" distL="114300" distR="114300" hidden="0" layoutInCell="1" locked="0" relativeHeight="0" simplePos="0">
+            <ns2:simplePos x="0" y="0"/>
+            <ns2:positionH relativeFrom="column">
+              <ns2:posOffset>4679950</ns2:posOffset>
+            </ns2:positionH>
+            <ns2:positionV relativeFrom="paragraph">
+              <ns2:posOffset>0</ns2:posOffset>
+            </ns2:positionV>
+            <ns2:extent cx="1307465" cy="1594485"/>
+            <ns2:effectExtent b="0" l="0" r="0" t="0"/>
+            <ns2:wrapSquare wrapText="bothSides" distB="0" distT="0" distL="114300" distR="114300"/>
+            <ns2:docPr id="12" name="image6.jpg"/>
+            <ns3:graphic>
+              <ns3:graphicData uri="http://schemas.openxmlformats.org/drawingml/2006/picture">
+                <ns4:pic>
+                  <ns4:nvPicPr>
+                    <ns4:cNvPr id="0" name="image6.jpg"/>
+                    <ns4:cNvPicPr preferRelativeResize="0"/>
+                  </ns4:nvPicPr>
+                  <ns4:blipFill>
+                    <ns3:blip ns5:embed="rId6"/>
+                    <ns3:srcRect b="0" l="0" r="0" t="0"/>
+                    <ns3:stretch>
+                      <ns3:fillRect/>
+                    </ns3:stretch>
+                  </ns4:blipFill>
+                  <ns4:spPr>
+                    <ns3:xfrm>
+                      <ns3:off x="0" y="0"/>
+                      <ns3:ext cx="1307465" cy="1594485"/>
+                    </ns3:xfrm>
+                    <ns3:prstGeom prst="rect"/>
+                    <ns3:ln/>
+                  </ns4:spPr>
+                </ns4:pic>
+              </ns3:graphicData>
+            </ns3:graphic>
+          </ns2:anchor>
         </w:drawing>
       </w:r>
       <w:r>
         <w:drawing>
-          <wp:anchor allowOverlap="1" behindDoc="0" distB="0" distT="0" distL="114300" distR="114300" hidden="0" layoutInCell="1" locked="0" relativeHeight="0" simplePos="0">
-            <wp:simplePos x="0" y="0"/>
-            <wp:positionH relativeFrom="column">
-              <wp:posOffset>-4762</wp:posOffset>
-            </wp:positionH>
-            <wp:positionV relativeFrom="paragraph">
-              <wp:posOffset>548366</wp:posOffset>
-            </wp:positionV>
-            <wp:extent cx="193675" cy="213360"/>
-            <wp:effectExtent b="0" l="0" r="0" t="0"/>
-            <wp:wrapSquare wrapText="bothSides" distB="0" distT="0" distL="114300" distR="114300"/>
-            <wp:docPr id="13" name="image4.png"/>
-            <a:graphic>
-              <a:graphicData uri="http://schemas.openxmlformats.org/drawingml/2006/picture">
-                <pic:pic>
-                  <pic:nvPicPr>
-                    <pic:cNvPr id="0" name="image4.png"/>
-                    <pic:cNvPicPr preferRelativeResize="0"/>
-                  </pic:nvPicPr>
-                  <pic:blipFill>
-                    <a:blip r:embed="rId7"/>
-                    <a:srcRect b="0" l="0" r="0" t="0"/>
-                    <a:stretch>
-                      <a:fillRect/>
-                    </a:stretch>
-                  </pic:blipFill>
-                  <pic:spPr>
-                    <a:xfrm>
-                      <a:off x="0" y="0"/>
-                      <a:ext cx="193675" cy="213360"/>
-                    </a:xfrm>
-                    <a:prstGeom prst="rect"/>
-                    <a:ln/>
-                  </pic:spPr>
-                </pic:pic>
-              </a:graphicData>
-            </a:graphic>
-          </wp:anchor>
+          <ns2:anchor allowOverlap="1" behindDoc="0" distB="0" distT="0" distL="114300" distR="114300" hidden="0" layoutInCell="1" locked="0" relativeHeight="0" simplePos="0">
+            <ns2:simplePos x="0" y="0"/>
+            <ns2:positionH relativeFrom="column">
+              <ns2:posOffset>-4762</ns2:posOffset>
+            </ns2:positionH>
+            <ns2:positionV relativeFrom="paragraph">
+              <ns2:posOffset>548366</ns2:posOffset>
+            </ns2:positionV>
+            <ns2:extent cx="193675" cy="213360"/>
+            <ns2:effectExtent b="0" l="0" r="0" t="0"/>
+            <ns2:wrapSquare wrapText="bothSides" distB="0" distT="0" distL="114300" distR="114300"/>
+            <ns2:docPr id="13" name="image4.png"/>
+            <ns3:graphic>
+              <ns3:graphicData uri="http://schemas.openxmlformats.org/drawingml/2006/picture">
+                <ns4:pic>
+                  <ns4:nvPicPr>
+                    <ns4:cNvPr id="0" name="image4.png"/>
+                    <ns4:cNvPicPr preferRelativeResize="0"/>
+                  </ns4:nvPicPr>
+                  <ns4:blipFill>
+                    <ns3:blip ns5:embed="rId7"/>
+                    <ns3:srcRect b="0" l="0" r="0" t="0"/>
+                    <ns3:stretch>
+                      <ns3:fillRect/>
+                    </ns3:stretch>
+                  </ns4:blipFill>
+                  <ns4:spPr>
+                    <ns3:xfrm>
+                      <ns3:off x="0" y="0"/>
+                      <ns3:ext cx="193675" cy="213360"/>
+                    </ns3:xfrm>
+                    <ns3:prstGeom prst="rect"/>
+                    <ns3:ln/>
+                  </ns4:spPr>
+                </ns4:pic>
+              </ns3:graphicData>
+            </ns3:graphic>
+          </ns2:anchor>
         </w:drawing>
       </w:r>
     </w:p>
-    <w:p>
+    <w:p ns1:paraId="00000002">
       <w:pPr>
         <w:rPr>
           <w:rFonts w:ascii="Arial" w:cs="Arial" w:eastAsia="Arial" w:hAnsi="Arial"/>
@@ -153,7 +153,7 @@
         </w:rPr>
       </w:r>
     </w:p>
-    <w:p>
+    <w:p ns1:paraId="00000003">
       <w:pPr>
         <w:rPr>
           <w:rFonts w:ascii="Arial" w:cs="Arial" w:eastAsia="Arial" w:hAnsi="Arial"/>
@@ -190,96 +190,96 @@
       </w:r>
       <w:r>
         <w:drawing>
-          <wp:anchor allowOverlap="1" behindDoc="0" distB="0" distT="0" distL="114300" distR="114300" hidden="0" layoutInCell="1" locked="0" relativeHeight="0" simplePos="0">
-            <wp:simplePos x="0" y="0"/>
-            <wp:positionH relativeFrom="column">
-              <wp:posOffset>1</wp:posOffset>
-            </wp:positionH>
-            <wp:positionV relativeFrom="paragraph">
-              <wp:posOffset>6311</wp:posOffset>
-            </wp:positionV>
-            <wp:extent cx="165867" cy="179514"/>
-            <wp:effectExtent b="0" l="0" r="0" t="0"/>
-            <wp:wrapNone/>
-            <wp:docPr id="15" name="image5.png"/>
-            <a:graphic>
-              <a:graphicData uri="http://schemas.openxmlformats.org/drawingml/2006/picture">
-                <pic:pic>
-                  <pic:nvPicPr>
-                    <pic:cNvPr id="0" name="image5.png"/>
-                    <pic:cNvPicPr preferRelativeResize="0"/>
-                  </pic:nvPicPr>
-                  <pic:blipFill>
-                    <a:blip r:embed="rId8"/>
-                    <a:srcRect b="0" l="0" r="0" t="0"/>
-                    <a:stretch>
-                      <a:fillRect/>
-                    </a:stretch>
-                  </pic:blipFill>
-                  <pic:spPr>
-                    <a:xfrm>
-                      <a:off x="0" y="0"/>
-                      <a:ext cx="165867" cy="179514"/>
-                    </a:xfrm>
-                    <a:prstGeom prst="rect"/>
-                    <a:ln/>
-                  </pic:spPr>
-                </pic:pic>
-              </a:graphicData>
-            </a:graphic>
-          </wp:anchor>
+          <ns2:anchor allowOverlap="1" behindDoc="0" distB="0" distT="0" distL="114300" distR="114300" hidden="0" layoutInCell="1" locked="0" relativeHeight="0" simplePos="0">
+            <ns2:simplePos x="0" y="0"/>
+            <ns2:positionH relativeFrom="column">
+              <ns2:posOffset>1</ns2:posOffset>
+            </ns2:positionH>
+            <ns2:positionV relativeFrom="paragraph">
+              <ns2:posOffset>6311</ns2:posOffset>
+            </ns2:positionV>
+            <ns2:extent cx="165867" cy="179514"/>
+            <ns2:effectExtent b="0" l="0" r="0" t="0"/>
+            <ns2:wrapNone/>
+            <ns2:docPr id="15" name="image5.png"/>
+            <ns3:graphic>
+              <ns3:graphicData uri="http://schemas.openxmlformats.org/drawingml/2006/picture">
+                <ns4:pic>
+                  <ns4:nvPicPr>
+                    <ns4:cNvPr id="0" name="image5.png"/>
+                    <ns4:cNvPicPr preferRelativeResize="0"/>
+                  </ns4:nvPicPr>
+                  <ns4:blipFill>
+                    <ns3:blip ns5:embed="rId8"/>
+                    <ns3:srcRect b="0" l="0" r="0" t="0"/>
+                    <ns3:stretch>
+                      <ns3:fillRect/>
+                    </ns3:stretch>
+                  </ns4:blipFill>
+                  <ns4:spPr>
+                    <ns3:xfrm>
+                      <ns3:off x="0" y="0"/>
+                      <ns3:ext cx="165867" cy="179514"/>
+                    </ns3:xfrm>
+                    <ns3:prstGeom prst="rect"/>
+                    <ns3:ln/>
+                  </ns4:spPr>
+                </ns4:pic>
+              </ns3:graphicData>
+            </ns3:graphic>
+          </ns2:anchor>
         </w:drawing>
       </w:r>
       <w:r>
         <w:drawing>
-          <wp:anchor allowOverlap="1" behindDoc="0" distB="0" distT="0" distL="114300" distR="114300" hidden="0" layoutInCell="1" locked="0" relativeHeight="0" simplePos="0">
-            <wp:simplePos x="0" y="0"/>
-            <wp:positionH relativeFrom="column">
-              <wp:posOffset>1</wp:posOffset>
-            </wp:positionH>
-            <wp:positionV relativeFrom="paragraph">
-              <wp:posOffset>246910</wp:posOffset>
-            </wp:positionV>
-            <wp:extent cx="166370" cy="156845"/>
-            <wp:effectExtent b="0" l="0" r="0" t="0"/>
-            <wp:wrapNone/>
-            <wp:docPr id="14" name="image7.png"/>
-            <a:graphic>
-              <a:graphicData uri="http://schemas.openxmlformats.org/drawingml/2006/picture">
-                <pic:pic>
-                  <pic:nvPicPr>
-                    <pic:cNvPr id="0" name="image7.png"/>
-                    <pic:cNvPicPr preferRelativeResize="0"/>
-                  </pic:nvPicPr>
-                  <pic:blipFill>
-                    <a:blip r:embed="rId9"/>
-                    <a:srcRect b="0" l="0" r="0" t="0"/>
-                    <a:stretch>
-                      <a:fillRect/>
-                    </a:stretch>
-                  </pic:blipFill>
-                  <pic:spPr>
-                    <a:xfrm>
-                      <a:off x="0" y="0"/>
-                      <a:ext cx="166370" cy="156845"/>
-                    </a:xfrm>
-                    <a:prstGeom prst="rect"/>
-                    <a:ln/>
-                  </pic:spPr>
-                </pic:pic>
-              </a:graphicData>
-            </a:graphic>
-          </wp:anchor>
+          <ns2:anchor allowOverlap="1" behindDoc="0" distB="0" distT="0" distL="114300" distR="114300" hidden="0" layoutInCell="1" locked="0" relativeHeight="0" simplePos="0">
+            <ns2:simplePos x="0" y="0"/>
+            <ns2:positionH relativeFrom="column">
+              <ns2:posOffset>1</ns2:posOffset>
+            </ns2:positionH>
+            <ns2:positionV relativeFrom="paragraph">
+              <ns2:posOffset>246910</ns2:posOffset>
+            </ns2:positionV>
+            <ns2:extent cx="166370" cy="156845"/>
+            <ns2:effectExtent b="0" l="0" r="0" t="0"/>
+            <ns2:wrapNone/>
+            <ns2:docPr id="14" name="image7.png"/>
+            <ns3:graphic>
+              <ns3:graphicData uri="http://schemas.openxmlformats.org/drawingml/2006/picture">
+                <ns4:pic>
+                  <ns4:nvPicPr>
+                    <ns4:cNvPr id="0" name="image7.png"/>
+                    <ns4:cNvPicPr preferRelativeResize="0"/>
+                  </ns4:nvPicPr>
+                  <ns4:blipFill>
+                    <ns3:blip ns5:embed="rId9"/>
+                    <ns3:srcRect b="0" l="0" r="0" t="0"/>
+                    <ns3:stretch>
+                      <ns3:fillRect/>
+                    </ns3:stretch>
+                  </ns4:blipFill>
+                  <ns4:spPr>
+                    <ns3:xfrm>
+                      <ns3:off x="0" y="0"/>
+                      <ns3:ext cx="166370" cy="156845"/>
+                    </ns3:xfrm>
+                    <ns3:prstGeom prst="rect"/>
+                    <ns3:ln/>
+                  </ns4:spPr>
+                </ns4:pic>
+              </ns3:graphicData>
+            </ns3:graphic>
+          </ns2:anchor>
         </w:drawing>
       </w:r>
     </w:p>
-    <w:p>
-      <w:pPr>
-        <w:rPr>
-          <w:rFonts w:ascii="Arial" w:cs="Arial" w:eastAsia="Arial" w:hAnsi="Arial"/>
-          <w:b w:val="1"/>
-          <w:bCs w:val="1"/>
-          <w:color w:val="5b9bd5"/>
+    <w:p ns1:paraId="00000006">
+      <w:pPr>
+        <w:spacing w:after="0" w:line="458" w:lineRule="auto"/>
+        <w:ind w:right="710"/>
+        <w:jc w:val="both"/>
+        <w:rPr>
+          <w:rFonts w:ascii="Arial" w:cs="Arial" w:eastAsia="Arial" w:hAnsi="Arial"/>
           <w:sz w:val="18"/>
           <w:szCs w:val="18"/>
         </w:rPr>
@@ -291,7 +291,17 @@
           <w:szCs w:val="18"/>
           <w:rtl w:val="0"/>
         </w:rPr>
-        <w:t xml:space="preserve">          Contact No: </w:t>
+        <w:t xml:space="preserve">          LinkedIn</w:t>
+      </w:r>
+      <w:r>
+        <w:rPr>
+          <w:rFonts w:ascii="Arial" w:cs="Arial" w:eastAsia="Arial" w:hAnsi="Arial"/>
+          <w:color w:val="2e75b5"/>
+          <w:sz w:val="18"/>
+          <w:szCs w:val="18"/>
+          <w:rtl w:val="0"/>
+        </w:rPr>
+        <w:t xml:space="preserve">: </w:t>
       </w:r>
       <w:r>
         <w:rPr>
@@ -303,58 +313,19 @@
           <w:szCs w:val="18"/>
           <w:rtl w:val="0"/>
         </w:rPr>
-        <w:t xml:space="preserve">+8801760396857</w:t>
-      </w:r>
-      <w:r>
-        <w:rPr>
-          <w:rtl w:val="0"/>
-        </w:rPr>
-      </w:r>
-      <w:r>
-        <w:drawing>
-          <wp:anchor allowOverlap="1" behindDoc="0" distB="0" distT="0" distL="114300" distR="114300" hidden="0" layoutInCell="1" locked="0" relativeHeight="0" simplePos="0">
-            <wp:simplePos x="0" y="0"/>
-            <wp:positionH relativeFrom="column">
-              <wp:posOffset>1</wp:posOffset>
-            </wp:positionH>
-            <wp:positionV relativeFrom="paragraph">
-              <wp:posOffset>214221</wp:posOffset>
-            </wp:positionV>
-            <wp:extent cx="185507" cy="196869"/>
-            <wp:effectExtent b="0" l="0" r="0" t="0"/>
-            <wp:wrapNone/>
-            <wp:docPr id="10" name="image1.png"/>
-            <a:graphic>
-              <a:graphicData uri="http://schemas.openxmlformats.org/drawingml/2006/picture">
-                <pic:pic>
-                  <pic:nvPicPr>
-                    <pic:cNvPr id="0" name="image1.png"/>
-                    <pic:cNvPicPr preferRelativeResize="0"/>
-                  </pic:nvPicPr>
-                  <pic:blipFill>
-                    <a:blip r:embed="rId10"/>
-                    <a:srcRect b="0" l="0" r="0" t="0"/>
-                    <a:stretch>
-                      <a:fillRect/>
-                    </a:stretch>
-                  </pic:blipFill>
-                  <pic:spPr>
-                    <a:xfrm>
-                      <a:off x="0" y="0"/>
-                      <a:ext cx="185507" cy="196869"/>
-                    </a:xfrm>
-                    <a:prstGeom prst="rect"/>
-                    <a:ln/>
-                  </pic:spPr>
-                </pic:pic>
-              </a:graphicData>
-            </a:graphic>
-          </wp:anchor>
-        </w:drawing>
+        <w:t xml:space="preserve">https://www.linkedin.com/in/md-shakil-37352918b/</w:t>
+      </w:r>
+      <w:r>
+        <w:rPr>
+          <w:rtl w:val="0"/>
+        </w:rPr>
       </w:r>
     </w:p>
-    <w:p>
-      <w:pPr>
+    <w:p ns1:paraId="00000007">
+      <w:pPr>
+        <w:spacing w:after="0" w:line="458" w:lineRule="auto"/>
+        <w:ind w:right="710"/>
+        <w:jc w:val="both"/>
         <w:rPr>
           <w:rFonts w:ascii="Arial" w:cs="Arial" w:eastAsia="Arial" w:hAnsi="Arial"/>
           <w:sz w:val="18"/>
@@ -368,145 +339,97 @@
           <w:szCs w:val="18"/>
           <w:rtl w:val="0"/>
         </w:rPr>
-        <w:t xml:space="preserve">          E-mail</w:t>
-      </w:r>
-      <w:r>
-        <w:rPr>
-          <w:rFonts w:ascii="Arial" w:cs="Arial" w:eastAsia="Arial" w:hAnsi="Arial"/>
-          <w:b w:val="1"/>
-          <w:bCs w:val="1"/>
+        <w:t xml:space="preserve">          </w:t>
+      </w:r>
+      <w:r>
+        <w:rPr>
+          <w:rFonts w:ascii="Arial" w:cs="Arial" w:eastAsia="Arial" w:hAnsi="Arial"/>
+          <w:color w:val="1593cb"/>
+          <w:sz w:val="18"/>
+          <w:szCs w:val="18"/>
+          <w:rtl w:val="0"/>
+        </w:rPr>
+        <w:t xml:space="preserve">Sex</w:t>
+      </w:r>
+      <w:r>
+        <w:rPr>
+          <w:rFonts w:ascii="Arial" w:cs="Arial" w:eastAsia="Arial" w:hAnsi="Arial"/>
+          <w:color w:val="1593cb"/>
+          <w:sz w:val="16"/>
+          <w:szCs w:val="16"/>
+          <w:rtl w:val="0"/>
+        </w:rPr>
+        <w:t xml:space="preserve"> </w:t>
+      </w:r>
+      <w:r>
+        <w:rPr>
+          <w:rFonts w:ascii="Arial" w:cs="Arial" w:eastAsia="Arial" w:hAnsi="Arial"/>
+          <w:color w:val="3f3a38"/>
+          <w:sz w:val="18"/>
+          <w:szCs w:val="18"/>
+          <w:rtl w:val="0"/>
+        </w:rPr>
+        <w:t xml:space="preserve">Male</w:t>
+      </w:r>
+      <w:r>
+        <w:rPr>
+          <w:rFonts w:ascii="Arial" w:cs="Arial" w:eastAsia="Arial" w:hAnsi="Arial"/>
+          <w:color w:val="1593cb"/>
+          <w:sz w:val="16"/>
+          <w:szCs w:val="16"/>
+          <w:rtl w:val="0"/>
+        </w:rPr>
+        <w:t xml:space="preserve"> </w:t>
+      </w:r>
+      <w:r>
+        <w:rPr>
+          <w:rFonts w:ascii="Arial" w:cs="Arial" w:eastAsia="Arial" w:hAnsi="Arial"/>
+          <w:color w:val="1593cb"/>
+          <w:sz w:val="18"/>
+          <w:szCs w:val="18"/>
+          <w:rtl w:val="0"/>
+        </w:rPr>
+        <w:t xml:space="preserve">| </w:t>
+      </w:r>
+      <w:r>
+        <w:rPr>
+          <w:rFonts w:ascii="Arial" w:cs="Arial" w:eastAsia="Arial" w:hAnsi="Arial"/>
+          <w:color w:val="1593cb"/>
+          <w:sz w:val="16"/>
+          <w:szCs w:val="16"/>
+          <w:rtl w:val="0"/>
+        </w:rPr>
+        <w:t xml:space="preserve"> </w:t>
+      </w:r>
+      <w:r>
+        <w:rPr>
+          <w:rFonts w:ascii="Arial" w:cs="Arial" w:eastAsia="Arial" w:hAnsi="Arial"/>
           <w:color w:val="2e75b5"/>
           <w:sz w:val="18"/>
           <w:szCs w:val="18"/>
           <w:rtl w:val="0"/>
         </w:rPr>
-        <w:t xml:space="preserve">: mdshakilmahmud517@gmail.com</w:t>
-      </w:r>
-      <w:r>
-        <w:rPr>
-          <w:rtl w:val="0"/>
-        </w:rPr>
-      </w:r>
-      <w:r>
-        <w:drawing>
-          <wp:anchor allowOverlap="1" behindDoc="0" distB="0" distT="0" distL="114300" distR="114300" hidden="0" layoutInCell="1" locked="0" relativeHeight="0" simplePos="0">
-            <wp:simplePos x="0" y="0"/>
-            <wp:positionH relativeFrom="column">
-              <wp:posOffset>1</wp:posOffset>
-            </wp:positionH>
-            <wp:positionV relativeFrom="paragraph">
-              <wp:posOffset>220176</wp:posOffset>
-            </wp:positionV>
-            <wp:extent cx="185124" cy="190500"/>
-            <wp:effectExtent b="0" l="0" r="0" t="0"/>
-            <wp:wrapNone/>
-            <wp:docPr id="11" name="image3.png"/>
-            <a:graphic>
-              <a:graphicData uri="http://schemas.openxmlformats.org/drawingml/2006/picture">
-                <pic:pic>
-                  <pic:nvPicPr>
-                    <pic:cNvPr id="0" name="image3.png"/>
-                    <pic:cNvPicPr preferRelativeResize="0"/>
-                  </pic:nvPicPr>
-                  <pic:blipFill>
-                    <a:blip r:embed="rId11"/>
-                    <a:srcRect b="0" l="0" r="0" t="0"/>
-                    <a:stretch>
-                      <a:fillRect/>
-                    </a:stretch>
-                  </pic:blipFill>
-                  <pic:spPr>
-                    <a:xfrm>
-                      <a:off x="0" y="0"/>
-                      <a:ext cx="185124" cy="190500"/>
-                    </a:xfrm>
-                    <a:prstGeom prst="rect"/>
-                    <a:ln/>
-                  </pic:spPr>
-                </pic:pic>
-              </a:graphicData>
-            </a:graphic>
-          </wp:anchor>
-        </w:drawing>
-      </w:r>
-    </w:p>
-    <w:p>
-      <w:pPr>
-        <w:spacing w:after="0" w:line="458" w:lineRule="auto"/>
-        <w:ind w:right="710"/>
-        <w:jc w:val="both"/>
-        <w:rPr>
-          <w:rFonts w:ascii="Arial" w:cs="Arial" w:eastAsia="Arial" w:hAnsi="Arial"/>
+        <w:t xml:space="preserve">Nationality</w:t>
+      </w:r>
+      <w:r>
+        <w:rPr>
+          <w:rFonts w:ascii="Arial" w:cs="Arial" w:eastAsia="Arial" w:hAnsi="Arial"/>
+          <w:color w:val="2e75b5"/>
+          <w:sz w:val="16"/>
+          <w:szCs w:val="16"/>
+          <w:rtl w:val="0"/>
+        </w:rPr>
+        <w:t xml:space="preserve"> </w:t>
+      </w:r>
+      <w:r>
+        <w:rPr>
+          <w:rFonts w:ascii="Arial" w:cs="Arial" w:eastAsia="Arial" w:hAnsi="Arial"/>
+          <w:color w:val="3f3a38"/>
           <w:sz w:val="18"/>
           <w:szCs w:val="18"/>
-        </w:rPr>
-      </w:pPr>
-      <w:r>
-        <w:rPr>
-          <w:rFonts w:ascii="Arial" w:cs="Arial" w:eastAsia="Arial" w:hAnsi="Arial"/>
-          <w:sz w:val="18"/>
-          <w:szCs w:val="18"/>
-          <w:rtl w:val="0"/>
-        </w:rPr>
-        <w:t xml:space="preserve">          LinkedIn</w:t>
-      </w:r>
-      <w:r>
-        <w:rPr>
-          <w:rFonts w:ascii="Arial" w:cs="Arial" w:eastAsia="Arial" w:hAnsi="Arial"/>
-          <w:color w:val="2e75b5"/>
-          <w:sz w:val="18"/>
-          <w:szCs w:val="18"/>
-          <w:rtl w:val="0"/>
-        </w:rPr>
-        <w:t xml:space="preserve">: </w:t>
-      </w:r>
-      <w:r>
-        <w:rPr>
-          <w:rFonts w:ascii="Arial" w:cs="Arial" w:eastAsia="Arial" w:hAnsi="Arial"/>
-          <w:b w:val="1"/>
-          <w:bCs w:val="1"/>
-          <w:color w:val="2e75b5"/>
-          <w:sz w:val="18"/>
-          <w:szCs w:val="18"/>
-          <w:rtl w:val="0"/>
-        </w:rPr>
-        <w:t xml:space="preserve">https://www.linkedin.com/in/md-shakil-37352918b/</w:t>
-      </w:r>
-      <w:r>
-        <w:rPr>
-          <w:rtl w:val="0"/>
-        </w:rPr>
-      </w:r>
-    </w:p>
-    <w:p>
-      <w:pPr>
-        <w:spacing w:after="0" w:line="458" w:lineRule="auto"/>
-        <w:ind w:right="710"/>
-        <w:jc w:val="both"/>
-        <w:rPr>
-          <w:rFonts w:ascii="Arial" w:cs="Arial" w:eastAsia="Arial" w:hAnsi="Arial"/>
-          <w:sz w:val="18"/>
-          <w:szCs w:val="18"/>
-        </w:rPr>
-      </w:pPr>
-      <w:r>
-        <w:rPr>
-          <w:rFonts w:ascii="Arial" w:cs="Arial" w:eastAsia="Arial" w:hAnsi="Arial"/>
-          <w:sz w:val="18"/>
-          <w:szCs w:val="18"/>
-          <w:rtl w:val="0"/>
-        </w:rPr>
-        <w:t xml:space="preserve">          </w:t>
-      </w:r>
-      <w:r>
-        <w:rPr>
-          <w:rFonts w:ascii="Arial" w:cs="Arial" w:eastAsia="Arial" w:hAnsi="Arial"/>
-          <w:color w:val="1593cb"/>
-          <w:sz w:val="18"/>
-          <w:szCs w:val="18"/>
-          <w:rtl w:val="0"/>
-        </w:rPr>
-        <w:t xml:space="preserve">Sex</w:t>
+          <w:rtl w:val="0"/>
+        </w:rPr>
+        <w:t xml:space="preserve">Bangladeshi</w:t>
       </w:r>
       <w:r>
         <w:rPr>
@@ -516,125 +439,6 @@
           <w:szCs w:val="16"/>
           <w:rtl w:val="0"/>
         </w:rPr>
-        <w:t xml:space="preserve"> </w:t>
-      </w:r>
-      <w:r>
-        <w:rPr>
-          <w:rFonts w:ascii="Arial" w:cs="Arial" w:eastAsia="Arial" w:hAnsi="Arial"/>
-          <w:color w:val="3f3a38"/>
-          <w:sz w:val="18"/>
-          <w:szCs w:val="18"/>
-          <w:rtl w:val="0"/>
-        </w:rPr>
-        <w:t xml:space="preserve">Male</w:t>
-      </w:r>
-      <w:r>
-        <w:rPr>
-          <w:rFonts w:ascii="Arial" w:cs="Arial" w:eastAsia="Arial" w:hAnsi="Arial"/>
-          <w:color w:val="1593cb"/>
-          <w:sz w:val="16"/>
-          <w:szCs w:val="16"/>
-          <w:rtl w:val="0"/>
-        </w:rPr>
-        <w:t xml:space="preserve"> </w:t>
-      </w:r>
-      <w:r>
-        <w:rPr>
-          <w:rFonts w:ascii="Arial" w:cs="Arial" w:eastAsia="Arial" w:hAnsi="Arial"/>
-          <w:color w:val="1593cb"/>
-          <w:sz w:val="18"/>
-          <w:szCs w:val="18"/>
-          <w:rtl w:val="0"/>
-        </w:rPr>
-        <w:t xml:space="preserve">| </w:t>
-      </w:r>
-      <w:r>
-        <w:rPr>
-          <w:rFonts w:ascii="Arial" w:cs="Arial" w:eastAsia="Arial" w:hAnsi="Arial"/>
-          <w:color w:val="2e75b5"/>
-          <w:sz w:val="18"/>
-          <w:szCs w:val="18"/>
-          <w:rtl w:val="0"/>
-        </w:rPr>
-        <w:t xml:space="preserve">Date of birth </w:t>
-      </w:r>
-      <w:r>
-        <w:rPr>
-          <w:rFonts w:ascii="Arial" w:cs="Arial" w:eastAsia="Arial" w:hAnsi="Arial"/>
-          <w:sz w:val="18"/>
-          <w:szCs w:val="18"/>
-          <w:rtl w:val="0"/>
-        </w:rPr>
-        <w:t xml:space="preserve">08/</w:t>
-      </w:r>
-      <w:r>
-        <w:rPr>
-          <w:rFonts w:ascii="Arial" w:cs="Arial" w:eastAsia="Arial" w:hAnsi="Arial"/>
-          <w:color w:val="3f3a38"/>
-          <w:sz w:val="18"/>
-          <w:szCs w:val="18"/>
-          <w:rtl w:val="0"/>
-        </w:rPr>
-        <w:t xml:space="preserve">07/1996</w:t>
-      </w:r>
-      <w:r>
-        <w:rPr>
-          <w:rFonts w:ascii="Arial" w:cs="Arial" w:eastAsia="Arial" w:hAnsi="Arial"/>
-          <w:color w:val="1593cb"/>
-          <w:sz w:val="16"/>
-          <w:szCs w:val="16"/>
-          <w:rtl w:val="0"/>
-        </w:rPr>
-        <w:t xml:space="preserve"> </w:t>
-      </w:r>
-      <w:r>
-        <w:rPr>
-          <w:rFonts w:ascii="Arial" w:cs="Arial" w:eastAsia="Arial" w:hAnsi="Arial"/>
-          <w:color w:val="1593cb"/>
-          <w:sz w:val="18"/>
-          <w:szCs w:val="18"/>
-          <w:rtl w:val="0"/>
-        </w:rPr>
-        <w:t xml:space="preserve">| </w:t>
-      </w:r>
-      <w:r>
-        <w:rPr>
-          <w:rFonts w:ascii="Arial" w:cs="Arial" w:eastAsia="Arial" w:hAnsi="Arial"/>
-          <w:color w:val="2e75b5"/>
-          <w:sz w:val="18"/>
-          <w:szCs w:val="18"/>
-          <w:rtl w:val="0"/>
-        </w:rPr>
-        <w:t xml:space="preserve">Nationality</w:t>
-      </w:r>
-      <w:r>
-        <w:rPr>
-          <w:rFonts w:ascii="Arial" w:cs="Arial" w:eastAsia="Arial" w:hAnsi="Arial"/>
-          <w:color w:val="2e75b5"/>
-          <w:sz w:val="16"/>
-          <w:szCs w:val="16"/>
-          <w:rtl w:val="0"/>
-        </w:rPr>
-        <w:t xml:space="preserve"> </w:t>
-      </w:r>
-      <w:r>
-        <w:rPr>
-          <w:rFonts w:ascii="Arial" w:cs="Arial" w:eastAsia="Arial" w:hAnsi="Arial"/>
-          <w:color w:val="3f3a38"/>
-          <w:sz w:val="18"/>
-          <w:szCs w:val="18"/>
-          <w:rtl w:val="0"/>
-        </w:rPr>
-        <w:t xml:space="preserve">Bangladeshi</w:t>
-      </w:r>
-      <w:r>
-        <w:rPr>
-          <w:rFonts w:ascii="Arial" w:cs="Arial" w:eastAsia="Arial" w:hAnsi="Arial"/>
-          <w:color w:val="1593cb"/>
-          <w:sz w:val="16"/>
-          <w:szCs w:val="16"/>
-          <w:rtl w:val="0"/>
-        </w:rPr>
         <w:t xml:space="preserve">  </w:t>
       </w:r>
       <w:r>
@@ -644,48 +448,48 @@
       </w:r>
       <w:r>
         <w:drawing>
-          <wp:anchor allowOverlap="1" behindDoc="0" distB="0" distT="0" distL="114300" distR="114300" hidden="0" layoutInCell="1" locked="0" relativeHeight="0" simplePos="0">
-            <wp:simplePos x="0" y="0"/>
-            <wp:positionH relativeFrom="column">
-              <wp:posOffset>1</wp:posOffset>
-            </wp:positionH>
-            <wp:positionV relativeFrom="paragraph">
-              <wp:posOffset>4808</wp:posOffset>
-            </wp:positionV>
-            <wp:extent cx="177800" cy="142504"/>
-            <wp:effectExtent b="0" l="0" r="0" t="0"/>
-            <wp:wrapNone/>
-            <wp:docPr id="9" name="image2.png"/>
-            <a:graphic>
-              <a:graphicData uri="http://schemas.openxmlformats.org/drawingml/2006/picture">
-                <pic:pic>
-                  <pic:nvPicPr>
-                    <pic:cNvPr id="0" name="image2.png"/>
-                    <pic:cNvPicPr preferRelativeResize="0"/>
-                  </pic:nvPicPr>
-                  <pic:blipFill>
-                    <a:blip r:embed="rId12"/>
-                    <a:srcRect b="0" l="0" r="0" t="0"/>
-                    <a:stretch>
-                      <a:fillRect/>
-                    </a:stretch>
-                  </pic:blipFill>
-                  <pic:spPr>
-                    <a:xfrm>
-                      <a:off x="0" y="0"/>
-                      <a:ext cx="177800" cy="142504"/>
-                    </a:xfrm>
-                    <a:prstGeom prst="rect"/>
-                    <a:ln/>
-                  </pic:spPr>
-                </pic:pic>
-              </a:graphicData>
-            </a:graphic>
-          </wp:anchor>
+          <ns2:anchor allowOverlap="1" behindDoc="0" distB="0" distT="0" distL="114300" distR="114300" hidden="0" layoutInCell="1" locked="0" relativeHeight="0" simplePos="0">
+            <ns2:simplePos x="0" y="0"/>
+            <ns2:positionH relativeFrom="column">
+              <ns2:posOffset>1</ns2:posOffset>
+            </ns2:positionH>
+            <ns2:positionV relativeFrom="paragraph">
+              <ns2:posOffset>4808</ns2:posOffset>
+            </ns2:positionV>
+            <ns2:extent cx="177800" cy="142504"/>
+            <ns2:effectExtent b="0" l="0" r="0" t="0"/>
+            <ns2:wrapNone/>
+            <ns2:docPr id="9" name="image2.png"/>
+            <ns3:graphic>
+              <ns3:graphicData uri="http://schemas.openxmlformats.org/drawingml/2006/picture">
+                <ns4:pic>
+                  <ns4:nvPicPr>
+                    <ns4:cNvPr id="0" name="image2.png"/>
+                    <ns4:cNvPicPr preferRelativeResize="0"/>
+                  </ns4:nvPicPr>
+                  <ns4:blipFill>
+                    <ns3:blip ns5:embed="rId12"/>
+                    <ns3:srcRect b="0" l="0" r="0" t="0"/>
+                    <ns3:stretch>
+                      <ns3:fillRect/>
+                    </ns3:stretch>
+                  </ns4:blipFill>
+                  <ns4:spPr>
+                    <ns3:xfrm>
+                      <ns3:off x="0" y="0"/>
+                      <ns3:ext cx="177800" cy="142504"/>
+                    </ns3:xfrm>
+                    <ns3:prstGeom prst="rect"/>
+                    <ns3:ln/>
+                  </ns4:spPr>
+                </ns4:pic>
+              </ns3:graphicData>
+            </ns3:graphic>
+          </ns2:anchor>
         </w:drawing>
       </w:r>
     </w:p>
-    <w:p>
+    <w:p ns1:paraId="00000008">
       <w:pPr>
         <w:keepNext w:val="0"/>
         <w:keepLines w:val="0"/>
@@ -724,53 +528,53 @@
         </w:rPr>
       </w:r>
       <w:r>
-        <mc:AlternateContent>
-          <mc:Choice Requires="wpg">
+        <ns6:AlternateContent>
+          <ns6:Choice Requires="wpg">
             <w:drawing>
-              <wp:anchor allowOverlap="1" behindDoc="0" distB="45720" distT="45720" distL="114300" distR="114300" hidden="0" layoutInCell="1" locked="0" relativeHeight="0" simplePos="0">
-                <wp:simplePos x="0" y="0"/>
-                <wp:positionH relativeFrom="column">
-                  <wp:posOffset>12701</wp:posOffset>
-                </wp:positionH>
-                <wp:positionV relativeFrom="paragraph">
-                  <wp:posOffset>248920</wp:posOffset>
-                </wp:positionV>
-                <wp:extent cx="5941060" cy="323850"/>
-                <wp:effectExtent b="0" l="0" r="0" t="0"/>
-                <wp:wrapSquare wrapText="bothSides" distB="45720" distT="45720" distL="114300" distR="114300"/>
-                <wp:docPr id="8" name=""/>
-                <a:graphic>
-                  <a:graphicData uri="http://schemas.microsoft.com/office/word/2010/wordprocessingShape">
-                    <wps:wsp>
-                      <wps:cNvSpPr/>
-                      <wps:cNvPr id="9" name="Shape 9"/>
-                      <wps:spPr>
-                        <a:xfrm>
-                          <a:off x="2380233" y="3622838"/>
-                          <a:ext cx="5931535" cy="314325"/>
-                        </a:xfrm>
-                        <a:prstGeom prst="rect">
-                          <a:avLst/>
-                        </a:prstGeom>
-                        <a:gradFill>
-                          <a:gsLst>
-                            <a:gs pos="0">
-                              <a:srgbClr val="70A5DA"/>
-                            </a:gs>
-                            <a:gs pos="50000">
-                              <a:srgbClr val="539BDB"/>
-                            </a:gs>
-                            <a:gs pos="100000">
-                              <a:srgbClr val="4288C8"/>
-                            </a:gs>
-                          </a:gsLst>
-                          <a:lin ang="5400000" scaled="0"/>
-                        </a:gradFill>
-                        <a:ln>
-                          <a:noFill/>
-                        </a:ln>
-                      </wps:spPr>
-                      <wps:txbx>
+              <ns2:anchor allowOverlap="1" behindDoc="0" distB="45720" distT="45720" distL="114300" distR="114300" hidden="0" layoutInCell="1" locked="0" relativeHeight="0" simplePos="0">
+                <ns2:simplePos x="0" y="0"/>
+                <ns2:positionH relativeFrom="column">
+                  <ns2:posOffset>12701</ns2:posOffset>
+                </ns2:positionH>
+                <ns2:positionV relativeFrom="paragraph">
+                  <ns2:posOffset>248920</ns2:posOffset>
+                </ns2:positionV>
+                <ns2:extent cx="5941060" cy="323850"/>
+                <ns2:effectExtent b="0" l="0" r="0" t="0"/>
+                <ns2:wrapSquare wrapText="bothSides" distB="45720" distT="45720" distL="114300" distR="114300"/>
+                <ns2:docPr id="8" name=""/>
+                <ns3:graphic>
+                  <ns3:graphicData uri="http://schemas.microsoft.com/office/word/2010/wordprocessingShape">
+                    <ns7:wsp>
+                      <ns7:cNvSpPr/>
+                      <ns7:cNvPr id="9" name="Shape 9"/>
+                      <ns7:spPr>
+                        <ns3:xfrm>
+                          <ns3:off x="2380233" y="3622838"/>
+                          <ns3:ext cx="5931535" cy="314325"/>
+                        </ns3:xfrm>
+                        <ns3:prstGeom prst="rect">
+                          <ns3:avLst/>
+                        </ns3:prstGeom>
+                        <ns3:gradFill>
+                          <ns3:gsLst>
+                            <ns3:gs pos="0">
+                              <ns3:srgbClr val="70A5DA"/>
+                            </ns3:gs>
+                            <ns3:gs pos="50000">
+                              <ns3:srgbClr val="539BDB"/>
+                            </ns3:gs>
+                            <ns3:gs pos="100000">
+                              <ns3:srgbClr val="4288C8"/>
+                            </ns3:gs>
+                          </ns3:gsLst>
+                          <ns3:lin ang="5400000" scaled="0"/>
+                        </ns3:gradFill>
+                        <ns3:ln>
+                          <ns3:noFill/>
+                        </ns3:ln>
+                      </ns7:spPr>
+                      <ns7:txbx>
                         <w:txbxContent>
                           <w:p>
                             <w:pPr>
@@ -794,62 +598,62 @@
                             </w:r>
                           </w:p>
                         </w:txbxContent>
-                      </wps:txbx>
-                      <wps:bodyPr anchorCtr="0" anchor="t" bIns="45700" lIns="91425" spcFirstLastPara="1" rIns="91425" wrap="square" tIns="45700">
-                        <a:noAutofit/>
-                      </wps:bodyPr>
-                    </wps:wsp>
-                  </a:graphicData>
-                </a:graphic>
-              </wp:anchor>
+                      </ns7:txbx>
+                      <ns7:bodyPr anchorCtr="0" anchor="t" bIns="45700" lIns="91425" spcFirstLastPara="1" rIns="91425" wrap="square" tIns="45700">
+                        <ns3:noAutofit/>
+                      </ns7:bodyPr>
+                    </ns7:wsp>
+                  </ns3:graphicData>
+                </ns3:graphic>
+              </ns2:anchor>
             </w:drawing>
-          </mc:Choice>
-          <mc:Fallback>
+          </ns6:Choice>
+          <ns6:Fallback>
             <w:drawing>
-              <wp:anchor allowOverlap="1" behindDoc="0" distB="45720" distT="45720" distL="114300" distR="114300" hidden="0" layoutInCell="1" locked="0" relativeHeight="0" simplePos="0">
-                <wp:simplePos x="0" y="0"/>
-                <wp:positionH relativeFrom="column">
-                  <wp:posOffset>12701</wp:posOffset>
-                </wp:positionH>
-                <wp:positionV relativeFrom="paragraph">
-                  <wp:posOffset>248920</wp:posOffset>
-                </wp:positionV>
-                <wp:extent cx="5941060" cy="323850"/>
-                <wp:effectExtent b="0" l="0" r="0" t="0"/>
-                <wp:wrapSquare wrapText="bothSides" distB="45720" distT="45720" distL="114300" distR="114300"/>
-                <wp:docPr id="8" name="image15.png"/>
-                <a:graphic>
-                  <a:graphicData uri="http://schemas.openxmlformats.org/drawingml/2006/picture">
-                    <pic:pic>
-                      <pic:nvPicPr>
-                        <pic:cNvPr id="0" name="image15.png"/>
-                        <pic:cNvPicPr preferRelativeResize="0"/>
-                      </pic:nvPicPr>
-                      <pic:blipFill>
-                        <a:blip r:embed="rId13"/>
-                        <a:srcRect/>
-                        <a:stretch>
-                          <a:fillRect/>
-                        </a:stretch>
-                      </pic:blipFill>
-                      <pic:spPr>
-                        <a:xfrm>
-                          <a:off x="0" y="0"/>
-                          <a:ext cx="5941060" cy="323850"/>
-                        </a:xfrm>
-                        <a:prstGeom prst="rect"/>
-                        <a:ln/>
-                      </pic:spPr>
-                    </pic:pic>
-                  </a:graphicData>
-                </a:graphic>
-              </wp:anchor>
+              <ns2:anchor allowOverlap="1" behindDoc="0" distB="45720" distT="45720" distL="114300" distR="114300" hidden="0" layoutInCell="1" locked="0" relativeHeight="0" simplePos="0">
+                <ns2:simplePos x="0" y="0"/>
+                <ns2:positionH relativeFrom="column">
+                  <ns2:posOffset>12701</ns2:posOffset>
+                </ns2:positionH>
+                <ns2:positionV relativeFrom="paragraph">
+                  <ns2:posOffset>248920</ns2:posOffset>
+                </ns2:positionV>
+                <ns2:extent cx="5941060" cy="323850"/>
+                <ns2:effectExtent b="0" l="0" r="0" t="0"/>
+                <ns2:wrapSquare wrapText="bothSides" distB="45720" distT="45720" distL="114300" distR="114300"/>
+                <ns2:docPr id="8" name="image15.png"/>
+                <ns3:graphic>
+                  <ns3:graphicData uri="http://schemas.openxmlformats.org/drawingml/2006/picture">
+                    <ns4:pic>
+                      <ns4:nvPicPr>
+                        <ns4:cNvPr id="0" name="image15.png"/>
+                        <ns4:cNvPicPr preferRelativeResize="0"/>
+                      </ns4:nvPicPr>
+                      <ns4:blipFill>
+                        <ns3:blip ns5:embed="rId13"/>
+                        <ns3:srcRect/>
+                        <ns3:stretch>
+                          <ns3:fillRect/>
+                        </ns3:stretch>
+                      </ns4:blipFill>
+                      <ns4:spPr>
+                        <ns3:xfrm>
+                          <ns3:off x="0" y="0"/>
+                          <ns3:ext cx="5941060" cy="323850"/>
+                        </ns3:xfrm>
+                        <ns3:prstGeom prst="rect"/>
+                        <ns3:ln/>
+                      </ns4:spPr>
+                    </ns4:pic>
+                  </ns3:graphicData>
+                </ns3:graphic>
+              </ns2:anchor>
             </w:drawing>
-          </mc:Fallback>
-        </mc:AlternateContent>
+          </ns6:Fallback>
+        </ns6:AlternateContent>
       </w:r>
     </w:p>
-    <w:p>
+    <w:p ns1:paraId="00000009">
       <w:pPr>
         <w:spacing w:after="26" w:lineRule="auto"/>
         <w:rPr>
@@ -865,7 +669,7 @@
         </w:rPr>
       </w:r>
     </w:p>
-    <w:p>
+    <w:p ns1:paraId="0000000A">
       <w:pPr>
         <w:spacing w:after="26" w:lineRule="auto"/>
         <w:rPr>
@@ -905,7 +709,7 @@
         <w:t xml:space="preserve"> and languages with other professional skills. That’s why I want to continue my professional career as a web developer. </w:t>
       </w:r>
     </w:p>
-    <w:p>
+    <w:p ns1:paraId="0000000B">
       <w:pPr>
         <w:spacing w:after="26" w:lineRule="auto"/>
         <w:rPr>
@@ -921,53 +725,53 @@
         </w:rPr>
       </w:r>
       <w:r>
-        <mc:AlternateContent>
-          <mc:Choice Requires="wpg">
+        <ns6:AlternateContent>
+          <ns6:Choice Requires="wpg">
             <w:drawing>
-              <wp:anchor allowOverlap="1" behindDoc="0" distB="45720" distT="45720" distL="114300" distR="114300" hidden="0" layoutInCell="1" locked="0" relativeHeight="0" simplePos="0">
-                <wp:simplePos x="0" y="0"/>
-                <wp:positionH relativeFrom="column">
-                  <wp:posOffset>25401</wp:posOffset>
-                </wp:positionH>
-                <wp:positionV relativeFrom="paragraph">
-                  <wp:posOffset>172720</wp:posOffset>
-                </wp:positionV>
-                <wp:extent cx="5934710" cy="318135"/>
-                <wp:effectExtent b="0" l="0" r="0" t="0"/>
-                <wp:wrapSquare wrapText="bothSides" distB="45720" distT="45720" distL="114300" distR="114300"/>
-                <wp:docPr id="7" name=""/>
-                <a:graphic>
-                  <a:graphicData uri="http://schemas.microsoft.com/office/word/2010/wordprocessingShape">
-                    <wps:wsp>
-                      <wps:cNvSpPr/>
-                      <wps:cNvPr id="8" name="Shape 8"/>
-                      <wps:spPr>
-                        <a:xfrm>
-                          <a:off x="2383408" y="3625695"/>
-                          <a:ext cx="5925185" cy="308610"/>
-                        </a:xfrm>
-                        <a:prstGeom prst="rect">
-                          <a:avLst/>
-                        </a:prstGeom>
-                        <a:gradFill>
-                          <a:gsLst>
-                            <a:gs pos="0">
-                              <a:srgbClr val="70A5DA"/>
-                            </a:gs>
-                            <a:gs pos="50000">
-                              <a:srgbClr val="539BDB"/>
-                            </a:gs>
-                            <a:gs pos="100000">
-                              <a:srgbClr val="4288C8"/>
-                            </a:gs>
-                          </a:gsLst>
-                          <a:lin ang="5400000" scaled="0"/>
-                        </a:gradFill>
-                        <a:ln>
-                          <a:noFill/>
-                        </a:ln>
-                      </wps:spPr>
-                      <wps:txbx>
+              <ns2:anchor allowOverlap="1" behindDoc="0" distB="45720" distT="45720" distL="114300" distR="114300" hidden="0" layoutInCell="1" locked="0" relativeHeight="0" simplePos="0">
+                <ns2:simplePos x="0" y="0"/>
+                <ns2:positionH relativeFrom="column">
+                  <ns2:posOffset>25401</ns2:posOffset>
+                </ns2:positionH>
+                <ns2:positionV relativeFrom="paragraph">
+                  <ns2:posOffset>172720</ns2:posOffset>
+                </ns2:positionV>
+                <ns2:extent cx="5934710" cy="318135"/>
+                <ns2:effectExtent b="0" l="0" r="0" t="0"/>
+                <ns2:wrapSquare wrapText="bothSides" distB="45720" distT="45720" distL="114300" distR="114300"/>
+                <ns2:docPr id="7" name=""/>
+                <ns3:graphic>
+                  <ns3:graphicData uri="http://schemas.microsoft.com/office/word/2010/wordprocessingShape">
+                    <ns7:wsp>
+                      <ns7:cNvSpPr/>
+                      <ns7:cNvPr id="8" name="Shape 8"/>
+                      <ns7:spPr>
+                        <ns3:xfrm>
+                          <ns3:off x="2383408" y="3625695"/>
+                          <ns3:ext cx="5925185" cy="308610"/>
+                        </ns3:xfrm>
+                        <ns3:prstGeom prst="rect">
+                          <ns3:avLst/>
+                        </ns3:prstGeom>
+                        <ns3:gradFill>
+                          <ns3:gsLst>
+                            <ns3:gs pos="0">
+                              <ns3:srgbClr val="70A5DA"/>
+                            </ns3:gs>
+                            <ns3:gs pos="50000">
+                              <ns3:srgbClr val="539BDB"/>
+                            </ns3:gs>
+                            <ns3:gs pos="100000">
+                              <ns3:srgbClr val="4288C8"/>
+                            </ns3:gs>
+                          </ns3:gsLst>
+                          <ns3:lin ang="5400000" scaled="0"/>
+                        </ns3:gradFill>
+                        <ns3:ln>
+                          <ns3:noFill/>
+                        </ns3:ln>
+                      </ns7:spPr>
+                      <ns7:txbx>
                         <w:txbxContent>
                           <w:p>
                             <w:pPr>
@@ -991,62 +795,62 @@
                             </w:r>
                           </w:p>
                         </w:txbxContent>
-                      </wps:txbx>
-                      <wps:bodyPr anchorCtr="0" anchor="t" bIns="45700" lIns="91425" spcFirstLastPara="1" rIns="91425" wrap="square" tIns="45700">
-                        <a:noAutofit/>
-                      </wps:bodyPr>
-                    </wps:wsp>
-                  </a:graphicData>
-                </a:graphic>
-              </wp:anchor>
+                      </ns7:txbx>
+                      <ns7:bodyPr anchorCtr="0" anchor="t" bIns="45700" lIns="91425" spcFirstLastPara="1" rIns="91425" wrap="square" tIns="45700">
+                        <ns3:noAutofit/>
+                      </ns7:bodyPr>
+                    </ns7:wsp>
+                  </ns3:graphicData>
+                </ns3:graphic>
+              </ns2:anchor>
             </w:drawing>
-          </mc:Choice>
-          <mc:Fallback>
+          </ns6:Choice>
+          <ns6:Fallback>
             <w:drawing>
-              <wp:anchor allowOverlap="1" behindDoc="0" distB="45720" distT="45720" distL="114300" distR="114300" hidden="0" layoutInCell="1" locked="0" relativeHeight="0" simplePos="0">
-                <wp:simplePos x="0" y="0"/>
-                <wp:positionH relativeFrom="column">
-                  <wp:posOffset>25401</wp:posOffset>
-                </wp:positionH>
-                <wp:positionV relativeFrom="paragraph">
-                  <wp:posOffset>172720</wp:posOffset>
-                </wp:positionV>
-                <wp:extent cx="5934710" cy="318135"/>
-                <wp:effectExtent b="0" l="0" r="0" t="0"/>
-                <wp:wrapSquare wrapText="bothSides" distB="45720" distT="45720" distL="114300" distR="114300"/>
-                <wp:docPr id="7" name="image14.png"/>
-                <a:graphic>
-                  <a:graphicData uri="http://schemas.openxmlformats.org/drawingml/2006/picture">
-                    <pic:pic>
-                      <pic:nvPicPr>
-                        <pic:cNvPr id="0" name="image14.png"/>
-                        <pic:cNvPicPr preferRelativeResize="0"/>
-                      </pic:nvPicPr>
-                      <pic:blipFill>
-                        <a:blip r:embed="rId13"/>
-                        <a:srcRect/>
-                        <a:stretch>
-                          <a:fillRect/>
-                        </a:stretch>
-                      </pic:blipFill>
-                      <pic:spPr>
-                        <a:xfrm>
-                          <a:off x="0" y="0"/>
-                          <a:ext cx="5934710" cy="318135"/>
-                        </a:xfrm>
-                        <a:prstGeom prst="rect"/>
-                        <a:ln/>
-                      </pic:spPr>
-                    </pic:pic>
-                  </a:graphicData>
-                </a:graphic>
-              </wp:anchor>
+              <ns2:anchor allowOverlap="1" behindDoc="0" distB="45720" distT="45720" distL="114300" distR="114300" hidden="0" layoutInCell="1" locked="0" relativeHeight="0" simplePos="0">
+                <ns2:simplePos x="0" y="0"/>
+                <ns2:positionH relativeFrom="column">
+                  <ns2:posOffset>25401</ns2:posOffset>
+                </ns2:positionH>
+                <ns2:positionV relativeFrom="paragraph">
+                  <ns2:posOffset>172720</ns2:posOffset>
+                </ns2:positionV>
+                <ns2:extent cx="5934710" cy="318135"/>
+                <ns2:effectExtent b="0" l="0" r="0" t="0"/>
+                <ns2:wrapSquare wrapText="bothSides" distB="45720" distT="45720" distL="114300" distR="114300"/>
+                <ns2:docPr id="7" name="image14.png"/>
+                <ns3:graphic>
+                  <ns3:graphicData uri="http://schemas.openxmlformats.org/drawingml/2006/picture">
+                    <ns4:pic>
+                      <ns4:nvPicPr>
+                        <ns4:cNvPr id="0" name="image14.png"/>
+                        <ns4:cNvPicPr preferRelativeResize="0"/>
+                      </ns4:nvPicPr>
+                      <ns4:blipFill>
+                        <ns3:blip ns5:embed="rId13"/>
+                        <ns3:srcRect/>
+                        <ns3:stretch>
+                          <ns3:fillRect/>
+                        </ns3:stretch>
+                      </ns4:blipFill>
+                      <ns4:spPr>
+                        <ns3:xfrm>
+                          <ns3:off x="0" y="0"/>
+                          <ns3:ext cx="5934710" cy="318135"/>
+                        </ns3:xfrm>
+                        <ns3:prstGeom prst="rect"/>
+                        <ns3:ln/>
+                      </ns4:spPr>
+                    </ns4:pic>
+                  </ns3:graphicData>
+                </ns3:graphic>
+              </ns2:anchor>
             </w:drawing>
-          </mc:Fallback>
-        </mc:AlternateContent>
+          </ns6:Fallback>
+        </ns6:AlternateContent>
       </w:r>
     </w:p>
-    <w:p>
+    <w:p ns1:paraId="0000000C">
       <w:pPr>
         <w:spacing w:after="26" w:lineRule="auto"/>
         <w:rPr/>
@@ -1087,7 +891,7 @@
         </w:rPr>
       </w:r>
     </w:p>
-    <w:p>
+    <w:p ns1:paraId="0000000D">
       <w:pPr>
         <w:rPr>
           <w:rFonts w:ascii="Arial" w:cs="Arial" w:eastAsia="Arial" w:hAnsi="Arial"/>
@@ -1117,7 +921,7 @@
         <w:t xml:space="preserve">Daffodil International University, Dhaka, Bangladesh</w:t>
       </w:r>
     </w:p>
-    <w:p>
+    <w:p ns1:paraId="0000000E">
       <w:pPr>
         <w:rPr>
           <w:rFonts w:ascii="Arial" w:cs="Arial" w:eastAsia="Arial" w:hAnsi="Arial"/>
@@ -1132,7 +936,7 @@
         </w:rPr>
       </w:r>
     </w:p>
-    <w:p>
+    <w:p ns1:paraId="0000000F">
       <w:pPr>
         <w:rPr>
           <w:rFonts w:ascii="Arial" w:cs="Arial" w:eastAsia="Arial" w:hAnsi="Arial"/>
@@ -1147,60 +951,60 @@
         </w:rPr>
       </w:r>
       <w:r>
-        <mc:AlternateContent>
-          <mc:Choice Requires="wpg">
+        <ns6:AlternateContent>
+          <ns6:Choice Requires="wpg">
             <w:drawing>
-              <wp:anchor allowOverlap="1" behindDoc="0" distB="45720" distT="45720" distL="114300" distR="114300" hidden="0" layoutInCell="1" locked="0" relativeHeight="0" simplePos="0">
-                <wp:simplePos x="0" y="0"/>
-                <wp:positionH relativeFrom="column">
-                  <wp:posOffset>1</wp:posOffset>
-                </wp:positionH>
-                <wp:positionV relativeFrom="paragraph">
-                  <wp:posOffset>163644</wp:posOffset>
-                </wp:positionV>
-                <wp:extent cx="5924550" cy="463101"/>
-                <wp:effectExtent b="0" l="0" r="0" t="0"/>
-                <wp:wrapSquare wrapText="bothSides" distB="45720" distT="45720" distL="114300" distR="114300"/>
-                <wp:docPr id="3" name=""/>
-                <a:graphic>
-                  <a:graphicData uri="http://schemas.microsoft.com/office/word/2010/wordprocessingShape">
-                    <wps:wsp>
-                      <wps:cNvSpPr/>
-                      <wps:cNvPr id="4" name="Shape 4"/>
-                      <wps:spPr>
-                        <a:xfrm>
-                          <a:off x="2386265" y="3633315"/>
-                          <a:ext cx="5919470" cy="293370"/>
-                        </a:xfrm>
-                        <a:prstGeom prst="rect">
-                          <a:avLst/>
-                        </a:prstGeom>
-                        <a:gradFill>
-                          <a:gsLst>
-                            <a:gs pos="0">
-                              <a:srgbClr val="70A5DA"/>
-                            </a:gs>
-                            <a:gs pos="50000">
-                              <a:srgbClr val="539BDB"/>
-                            </a:gs>
-                            <a:gs pos="100000">
-                              <a:srgbClr val="4288C8"/>
-                            </a:gs>
-                          </a:gsLst>
-                          <a:lin ang="5400000" scaled="0"/>
-                        </a:gradFill>
-                        <a:ln>
-                          <a:noFill/>
-                        </a:ln>
-                        <a:effectLst>
-                          <a:outerShdw blurRad="57150" rotWithShape="0" algn="ctr" dir="5400000" dist="19050">
-                            <a:srgbClr val="000000">
-                              <a:alpha val="62745"/>
-                            </a:srgbClr>
-                          </a:outerShdw>
-                        </a:effectLst>
-                      </wps:spPr>
-                      <wps:txbx>
+              <ns2:anchor allowOverlap="1" behindDoc="0" distB="45720" distT="45720" distL="114300" distR="114300" hidden="0" layoutInCell="1" locked="0" relativeHeight="0" simplePos="0">
+                <ns2:simplePos x="0" y="0"/>
+                <ns2:positionH relativeFrom="column">
+                  <ns2:posOffset>1</ns2:posOffset>
+                </ns2:positionH>
+                <ns2:positionV relativeFrom="paragraph">
+                  <ns2:posOffset>163644</ns2:posOffset>
+                </ns2:positionV>
+                <ns2:extent cx="5924550" cy="463101"/>
+                <ns2:effectExtent b="0" l="0" r="0" t="0"/>
+                <ns2:wrapSquare wrapText="bothSides" distB="45720" distT="45720" distL="114300" distR="114300"/>
+                <ns2:docPr id="3" name=""/>
+                <ns3:graphic>
+                  <ns3:graphicData uri="http://schemas.microsoft.com/office/word/2010/wordprocessingShape">
+                    <ns7:wsp>
+                      <ns7:cNvSpPr/>
+                      <ns7:cNvPr id="4" name="Shape 4"/>
+                      <ns7:spPr>
+                        <ns3:xfrm>
+                          <ns3:off x="2386265" y="3633315"/>
+                          <ns3:ext cx="5919470" cy="293370"/>
+                        </ns3:xfrm>
+                        <ns3:prstGeom prst="rect">
+                          <ns3:avLst/>
+                        </ns3:prstGeom>
+                        <ns3:gradFill>
+                          <ns3:gsLst>
+                            <ns3:gs pos="0">
+                              <ns3:srgbClr val="70A5DA"/>
+                            </ns3:gs>
+                            <ns3:gs pos="50000">
+                              <ns3:srgbClr val="539BDB"/>
+                            </ns3:gs>
+                            <ns3:gs pos="100000">
+                              <ns3:srgbClr val="4288C8"/>
+                            </ns3:gs>
+                          </ns3:gsLst>
+                          <ns3:lin ang="5400000" scaled="0"/>
+                        </ns3:gradFill>
+                        <ns3:ln>
+                          <ns3:noFill/>
+                        </ns3:ln>
+                        <ns3:effectLst>
+                          <ns3:outerShdw blurRad="57150" rotWithShape="0" algn="ctr" dir="5400000" dist="19050">
+                            <ns3:srgbClr val="000000">
+                              <ns3:alpha val="62745"/>
+                            </ns3:srgbClr>
+                          </ns3:outerShdw>
+                        </ns3:effectLst>
+                      </ns7:spPr>
+                      <ns7:txbx>
                         <w:txbxContent>
                           <w:p>
                             <w:pPr>
@@ -1224,62 +1028,62 @@
                             </w:r>
                           </w:p>
                         </w:txbxContent>
-                      </wps:txbx>
-                      <wps:bodyPr anchorCtr="0" anchor="t" bIns="45700" lIns="91425" spcFirstLastPara="1" rIns="91425" wrap="square" tIns="45700">
-                        <a:noAutofit/>
-                      </wps:bodyPr>
-                    </wps:wsp>
-                  </a:graphicData>
-                </a:graphic>
-              </wp:anchor>
+                      </ns7:txbx>
+                      <ns7:bodyPr anchorCtr="0" anchor="t" bIns="45700" lIns="91425" spcFirstLastPara="1" rIns="91425" wrap="square" tIns="45700">
+                        <ns3:noAutofit/>
+                      </ns7:bodyPr>
+                    </ns7:wsp>
+                  </ns3:graphicData>
+                </ns3:graphic>
+              </ns2:anchor>
             </w:drawing>
-          </mc:Choice>
-          <mc:Fallback>
+          </ns6:Choice>
+          <ns6:Fallback>
             <w:drawing>
-              <wp:anchor allowOverlap="1" behindDoc="0" distB="45720" distT="45720" distL="114300" distR="114300" hidden="0" layoutInCell="1" locked="0" relativeHeight="0" simplePos="0">
-                <wp:simplePos x="0" y="0"/>
-                <wp:positionH relativeFrom="column">
-                  <wp:posOffset>1</wp:posOffset>
-                </wp:positionH>
-                <wp:positionV relativeFrom="paragraph">
-                  <wp:posOffset>163644</wp:posOffset>
-                </wp:positionV>
-                <wp:extent cx="5924550" cy="463101"/>
-                <wp:effectExtent b="0" l="0" r="0" t="0"/>
-                <wp:wrapSquare wrapText="bothSides" distB="45720" distT="45720" distL="114300" distR="114300"/>
-                <wp:docPr id="3" name="image10.png"/>
-                <a:graphic>
-                  <a:graphicData uri="http://schemas.openxmlformats.org/drawingml/2006/picture">
-                    <pic:pic>
-                      <pic:nvPicPr>
-                        <pic:cNvPr id="0" name="image10.png"/>
-                        <pic:cNvPicPr preferRelativeResize="0"/>
-                      </pic:nvPicPr>
-                      <pic:blipFill>
-                        <a:blip r:embed="rId13"/>
-                        <a:srcRect/>
-                        <a:stretch>
-                          <a:fillRect/>
-                        </a:stretch>
-                      </pic:blipFill>
-                      <pic:spPr>
-                        <a:xfrm>
-                          <a:off x="0" y="0"/>
-                          <a:ext cx="5924550" cy="463101"/>
-                        </a:xfrm>
-                        <a:prstGeom prst="rect"/>
-                        <a:ln/>
-                      </pic:spPr>
-                    </pic:pic>
-                  </a:graphicData>
-                </a:graphic>
-              </wp:anchor>
+              <ns2:anchor allowOverlap="1" behindDoc="0" distB="45720" distT="45720" distL="114300" distR="114300" hidden="0" layoutInCell="1" locked="0" relativeHeight="0" simplePos="0">
+                <ns2:simplePos x="0" y="0"/>
+                <ns2:positionH relativeFrom="column">
+                  <ns2:posOffset>1</ns2:posOffset>
+                </ns2:positionH>
+                <ns2:positionV relativeFrom="paragraph">
+                  <ns2:posOffset>163644</ns2:posOffset>
+                </ns2:positionV>
+                <ns2:extent cx="5924550" cy="463101"/>
+                <ns2:effectExtent b="0" l="0" r="0" t="0"/>
+                <ns2:wrapSquare wrapText="bothSides" distB="45720" distT="45720" distL="114300" distR="114300"/>
+                <ns2:docPr id="3" name="image10.png"/>
+                <ns3:graphic>
+                  <ns3:graphicData uri="http://schemas.openxmlformats.org/drawingml/2006/picture">
+                    <ns4:pic>
+                      <ns4:nvPicPr>
+                        <ns4:cNvPr id="0" name="image10.png"/>
+                        <ns4:cNvPicPr preferRelativeResize="0"/>
+                      </ns4:nvPicPr>
+                      <ns4:blipFill>
+                        <ns3:blip ns5:embed="rId13"/>
+                        <ns3:srcRect/>
+                        <ns3:stretch>
+                          <ns3:fillRect/>
+                        </ns3:stretch>
+                      </ns4:blipFill>
+                      <ns4:spPr>
+                        <ns3:xfrm>
+                          <ns3:off x="0" y="0"/>
+                          <ns3:ext cx="5924550" cy="463101"/>
+                        </ns3:xfrm>
+                        <ns3:prstGeom prst="rect"/>
+                        <ns3:ln/>
+                      </ns4:spPr>
+                    </ns4:pic>
+                  </ns3:graphicData>
+                </ns3:graphic>
+              </ns2:anchor>
             </w:drawing>
-          </mc:Fallback>
-        </mc:AlternateContent>
+          </ns6:Fallback>
+        </ns6:AlternateContent>
       </w:r>
     </w:p>
-    <w:p>
+    <w:p ns1:paraId="00000010">
       <w:pPr>
         <w:rPr>
           <w:rFonts w:ascii="Arial" w:cs="Arial" w:eastAsia="Arial" w:hAnsi="Arial"/>
@@ -1293,7 +1097,7 @@
         </w:rPr>
       </w:r>
     </w:p>
-    <w:p>
+    <w:p ns1:paraId="00000011">
       <w:pPr>
         <w:keepNext w:val="0"/>
         <w:keepLines w:val="0"/>
@@ -1374,7 +1178,7 @@
         </w:rPr>
       </w:r>
     </w:p>
-    <w:p>
+    <w:p ns1:paraId="00000012">
       <w:pPr>
         <w:keepNext w:val="0"/>
         <w:keepLines w:val="0"/>
@@ -1498,7 +1302,7 @@
         <w:t xml:space="preserve"> PHP, Javascript) </w:t>
       </w:r>
     </w:p>
-    <w:p>
+    <w:p ns1:paraId="00000013">
       <w:pPr>
         <w:keepNext w:val="0"/>
         <w:keepLines w:val="0"/>
@@ -1537,7 +1341,7 @@
         </w:rPr>
       </w:r>
     </w:p>
-    <w:p>
+    <w:p ns1:paraId="00000014">
       <w:pPr>
         <w:keepNext w:val="0"/>
         <w:keepLines w:val="0"/>
@@ -1613,7 +1417,7 @@
         <w:t xml:space="preserve">(October, 2019 – October,2020)</w:t>
       </w:r>
     </w:p>
-    <w:p>
+    <w:p ns1:paraId="00000015">
       <w:pPr>
         <w:keepNext w:val="0"/>
         <w:keepLines w:val="0"/>
@@ -1670,7 +1474,7 @@
         <w:t xml:space="preserve">Software Engineer (React js, Next js and PHP Developer)</w:t>
       </w:r>
     </w:p>
-    <w:p>
+    <w:p ns1:paraId="00000016">
       <w:pPr>
         <w:keepNext w:val="0"/>
         <w:keepLines w:val="0"/>
@@ -1765,7 +1569,7 @@
         <w:t xml:space="preserve">                    </w:t>
       </w:r>
     </w:p>
-    <w:p>
+    <w:p ns1:paraId="00000017">
       <w:pPr>
         <w:keepNext w:val="0"/>
         <w:keepLines w:val="0"/>
@@ -1822,7 +1626,7 @@
         <w:t xml:space="preserve">Laravel API Developer </w:t>
       </w:r>
     </w:p>
-    <w:p>
+    <w:p ns1:paraId="00000018">
       <w:pPr>
         <w:keepNext w:val="0"/>
         <w:keepLines w:val="0"/>
@@ -1861,7 +1665,7 @@
         </w:rPr>
       </w:r>
     </w:p>
-    <w:p>
+    <w:p ns1:paraId="00000019">
       <w:pPr>
         <w:rPr>
           <w:rFonts w:ascii="Arial" w:cs="Arial" w:eastAsia="Arial" w:hAnsi="Arial"/>
@@ -1875,7 +1679,7 @@
         </w:rPr>
       </w:r>
     </w:p>
-    <w:p>
+    <w:p ns1:paraId="0000001A">
       <w:pPr>
         <w:rPr>
           <w:rFonts w:ascii="Arial" w:cs="Arial" w:eastAsia="Arial" w:hAnsi="Arial"/>
@@ -1889,7 +1693,7 @@
         </w:rPr>
       </w:r>
     </w:p>
-    <w:p>
+    <w:p ns1:paraId="0000001B">
       <w:pPr>
         <w:rPr>
           <w:rFonts w:ascii="Arial" w:cs="Arial" w:eastAsia="Arial" w:hAnsi="Arial"/>
@@ -1904,53 +1708,53 @@
         </w:rPr>
       </w:r>
       <w:r>
-        <mc:AlternateContent>
-          <mc:Choice Requires="wpg">
+        <ns6:AlternateContent>
+          <ns6:Choice Requires="wpg">
             <w:drawing>
-              <wp:anchor allowOverlap="1" behindDoc="0" distB="45720" distT="45720" distL="114300" distR="114300" hidden="0" layoutInCell="1" locked="0" relativeHeight="0" simplePos="0">
-                <wp:simplePos x="0" y="0"/>
-                <wp:positionH relativeFrom="column">
-                  <wp:posOffset>25401</wp:posOffset>
-                </wp:positionH>
-                <wp:positionV relativeFrom="paragraph">
-                  <wp:posOffset>45720</wp:posOffset>
-                </wp:positionV>
-                <wp:extent cx="5928995" cy="288290"/>
-                <wp:effectExtent b="0" l="0" r="0" t="0"/>
-                <wp:wrapSquare wrapText="bothSides" distB="45720" distT="45720" distL="114300" distR="114300"/>
-                <wp:docPr id="2" name=""/>
-                <a:graphic>
-                  <a:graphicData uri="http://schemas.microsoft.com/office/word/2010/wordprocessingShape">
-                    <wps:wsp>
-                      <wps:cNvSpPr/>
-                      <wps:cNvPr id="3" name="Shape 3"/>
-                      <wps:spPr>
-                        <a:xfrm>
-                          <a:off x="2386265" y="3640618"/>
-                          <a:ext cx="5919470" cy="278765"/>
-                        </a:xfrm>
-                        <a:prstGeom prst="rect">
-                          <a:avLst/>
-                        </a:prstGeom>
-                        <a:gradFill>
-                          <a:gsLst>
-                            <a:gs pos="0">
-                              <a:srgbClr val="70A5DA"/>
-                            </a:gs>
-                            <a:gs pos="50000">
-                              <a:srgbClr val="539BDB"/>
-                            </a:gs>
-                            <a:gs pos="100000">
-                              <a:srgbClr val="4288C8"/>
-                            </a:gs>
-                          </a:gsLst>
-                          <a:lin ang="5400000" scaled="0"/>
-                        </a:gradFill>
-                        <a:ln>
-                          <a:noFill/>
-                        </a:ln>
-                      </wps:spPr>
-                      <wps:txbx>
+              <ns2:anchor allowOverlap="1" behindDoc="0" distB="45720" distT="45720" distL="114300" distR="114300" hidden="0" layoutInCell="1" locked="0" relativeHeight="0" simplePos="0">
+                <ns2:simplePos x="0" y="0"/>
+                <ns2:positionH relativeFrom="column">
+                  <ns2:posOffset>25401</ns2:posOffset>
+                </ns2:positionH>
+                <ns2:positionV relativeFrom="paragraph">
+                  <ns2:posOffset>45720</ns2:posOffset>
+                </ns2:positionV>
+                <ns2:extent cx="5928995" cy="288290"/>
+                <ns2:effectExtent b="0" l="0" r="0" t="0"/>
+                <ns2:wrapSquare wrapText="bothSides" distB="45720" distT="45720" distL="114300" distR="114300"/>
+                <ns2:docPr id="2" name=""/>
+                <ns3:graphic>
+                  <ns3:graphicData uri="http://schemas.microsoft.com/office/word/2010/wordprocessingShape">
+                    <ns7:wsp>
+                      <ns7:cNvSpPr/>
+                      <ns7:cNvPr id="3" name="Shape 3"/>
+                      <ns7:spPr>
+                        <ns3:xfrm>
+                          <ns3:off x="2386265" y="3640618"/>
+                          <ns3:ext cx="5919470" cy="278765"/>
+                        </ns3:xfrm>
+                        <ns3:prstGeom prst="rect">
+                          <ns3:avLst/>
+                        </ns3:prstGeom>
+                        <ns3:gradFill>
+                          <ns3:gsLst>
+                            <ns3:gs pos="0">
+                              <ns3:srgbClr val="70A5DA"/>
+                            </ns3:gs>
+                            <ns3:gs pos="50000">
+                              <ns3:srgbClr val="539BDB"/>
+                            </ns3:gs>
+                            <ns3:gs pos="100000">
+                              <ns3:srgbClr val="4288C8"/>
+                            </ns3:gs>
+                          </ns3:gsLst>
+                          <ns3:lin ang="5400000" scaled="0"/>
+                        </ns3:gradFill>
+                        <ns3:ln>
+                          <ns3:noFill/>
+                        </ns3:ln>
+                      </ns7:spPr>
+                      <ns7:txbx>
                         <w:txbxContent>
                           <w:p>
                             <w:pPr>
@@ -1974,59 +1778,59 @@
                             </w:r>
                           </w:p>
                         </w:txbxContent>
-                      </wps:txbx>
-                      <wps:bodyPr anchorCtr="0" anchor="t" bIns="45700" lIns="91425" spcFirstLastPara="1" rIns="91425" wrap="square" tIns="45700">
-                        <a:noAutofit/>
-                      </wps:bodyPr>
-                    </wps:wsp>
-                  </a:graphicData>
-                </a:graphic>
-              </wp:anchor>
+                      </ns7:txbx>
+                      <ns7:bodyPr anchorCtr="0" anchor="t" bIns="45700" lIns="91425" spcFirstLastPara="1" rIns="91425" wrap="square" tIns="45700">
+                        <ns3:noAutofit/>
+                      </ns7:bodyPr>
+                    </ns7:wsp>
+                  </ns3:graphicData>
+                </ns3:graphic>
+              </ns2:anchor>
             </w:drawing>
-          </mc:Choice>
-          <mc:Fallback>
+          </ns6:Choice>
+          <ns6:Fallback>
             <w:drawing>
-              <wp:anchor allowOverlap="1" behindDoc="0" distB="45720" distT="45720" distL="114300" distR="114300" hidden="0" layoutInCell="1" locked="0" relativeHeight="0" simplePos="0">
-                <wp:simplePos x="0" y="0"/>
-                <wp:positionH relativeFrom="column">
-                  <wp:posOffset>25401</wp:posOffset>
-                </wp:positionH>
-                <wp:positionV relativeFrom="paragraph">
-                  <wp:posOffset>45720</wp:posOffset>
-                </wp:positionV>
-                <wp:extent cx="5928995" cy="288290"/>
-                <wp:effectExtent b="0" l="0" r="0" t="0"/>
-                <wp:wrapSquare wrapText="bothSides" distB="45720" distT="45720" distL="114300" distR="114300"/>
-                <wp:docPr id="2" name="image9.png"/>
-                <a:graphic>
-                  <a:graphicData uri="http://schemas.openxmlformats.org/drawingml/2006/picture">
-                    <pic:pic>
-                      <pic:nvPicPr>
-                        <pic:cNvPr id="0" name="image9.png"/>
-                        <pic:cNvPicPr preferRelativeResize="0"/>
-                      </pic:nvPicPr>
-                      <pic:blipFill>
-                        <a:blip r:embed="rId13"/>
-                        <a:srcRect/>
-                        <a:stretch>
-                          <a:fillRect/>
-                        </a:stretch>
-                      </pic:blipFill>
-                      <pic:spPr>
-                        <a:xfrm>
-                          <a:off x="0" y="0"/>
-                          <a:ext cx="5928995" cy="288290"/>
-                        </a:xfrm>
-                        <a:prstGeom prst="rect"/>
-                        <a:ln/>
-                      </pic:spPr>
-                    </pic:pic>
-                  </a:graphicData>
-                </a:graphic>
-              </wp:anchor>
+              <ns2:anchor allowOverlap="1" behindDoc="0" distB="45720" distT="45720" distL="114300" distR="114300" hidden="0" layoutInCell="1" locked="0" relativeHeight="0" simplePos="0">
+                <ns2:simplePos x="0" y="0"/>
+                <ns2:positionH relativeFrom="column">
+                  <ns2:posOffset>25401</ns2:posOffset>
+                </ns2:positionH>
+                <ns2:positionV relativeFrom="paragraph">
+                  <ns2:posOffset>45720</ns2:posOffset>
+                </ns2:positionV>
+                <ns2:extent cx="5928995" cy="288290"/>
+                <ns2:effectExtent b="0" l="0" r="0" t="0"/>
+                <ns2:wrapSquare wrapText="bothSides" distB="45720" distT="45720" distL="114300" distR="114300"/>
+                <ns2:docPr id="2" name="image9.png"/>
+                <ns3:graphic>
+                  <ns3:graphicData uri="http://schemas.openxmlformats.org/drawingml/2006/picture">
+                    <ns4:pic>
+                      <ns4:nvPicPr>
+                        <ns4:cNvPr id="0" name="image9.png"/>
+                        <ns4:cNvPicPr preferRelativeResize="0"/>
+                      </ns4:nvPicPr>
+                      <ns4:blipFill>
+                        <ns3:blip ns5:embed="rId13"/>
+                        <ns3:srcRect/>
+                        <ns3:stretch>
+                          <ns3:fillRect/>
+                        </ns3:stretch>
+                      </ns4:blipFill>
+                      <ns4:spPr>
+                        <ns3:xfrm>
+                          <ns3:off x="0" y="0"/>
+                          <ns3:ext cx="5928995" cy="288290"/>
+                        </ns3:xfrm>
+                        <ns3:prstGeom prst="rect"/>
+                        <ns3:ln/>
+                      </ns4:spPr>
+                    </ns4:pic>
+                  </ns3:graphicData>
+                </ns3:graphic>
+              </ns2:anchor>
             </w:drawing>
-          </mc:Fallback>
-        </mc:AlternateContent>
+          </ns6:Fallback>
+        </ns6:AlternateContent>
       </w:r>
     </w:p>
     <w:tbl>
@@ -2066,7 +1870,7 @@
         </w:trPr>
         <w:tc>
           <w:tcPr/>
-          <w:p>
+          <w:p ns1:paraId="0000001C">
             <w:pPr>
               <w:jc w:val="both"/>
               <w:rPr>
@@ -2091,7 +1895,7 @@
               <w:t xml:space="preserve">Framework Skills  </w:t>
             </w:r>
           </w:p>
-          <w:p>
+          <w:p ns1:paraId="0000001D">
             <w:pPr>
               <w:jc w:val="both"/>
               <w:rPr>
@@ -2140,7 +1944,7 @@
               <w:t xml:space="preserve">):</w:t>
             </w:r>
           </w:p>
-          <w:p>
+          <w:p ns1:paraId="0000001E">
             <w:pPr>
               <w:keepNext w:val="0"/>
               <w:keepLines w:val="0"/>
@@ -2197,7 +2001,7 @@
               <w:t xml:space="preserve">Laravel</w:t>
             </w:r>
           </w:p>
-          <w:p>
+          <w:p ns1:paraId="0000001F">
             <w:pPr>
               <w:keepNext w:val="0"/>
               <w:keepLines w:val="0"/>
@@ -2254,7 +2058,7 @@
               <w:t xml:space="preserve">ASP.NET</w:t>
             </w:r>
           </w:p>
-          <w:p>
+          <w:p ns1:paraId="00000020">
             <w:pPr>
               <w:keepNext w:val="0"/>
               <w:keepLines w:val="0"/>
@@ -2311,7 +2115,7 @@
               <w:t xml:space="preserve">React js</w:t>
             </w:r>
           </w:p>
-          <w:p>
+          <w:p ns1:paraId="00000021">
             <w:pPr>
               <w:keepNext w:val="0"/>
               <w:keepLines w:val="0"/>
@@ -2368,7 +2172,7 @@
               <w:t xml:space="preserve">Next Js</w:t>
             </w:r>
           </w:p>
-          <w:p>
+          <w:p ns1:paraId="00000022">
             <w:pPr>
               <w:keepNext w:val="0"/>
               <w:keepLines w:val="0"/>
@@ -2425,7 +2229,7 @@
               <w:t xml:space="preserve">Lumen</w:t>
             </w:r>
           </w:p>
-          <w:p>
+          <w:p ns1:paraId="00000023">
             <w:pPr>
               <w:keepNext w:val="0"/>
               <w:keepLines w:val="0"/>
@@ -2482,7 +2286,7 @@
               <w:t xml:space="preserve">Slim </w:t>
             </w:r>
           </w:p>
-          <w:p>
+          <w:p ns1:paraId="00000024">
             <w:pPr>
               <w:keepNext w:val="0"/>
               <w:keepLines w:val="0"/>
@@ -2539,7 +2343,7 @@
               <w:t xml:space="preserve">Express</w:t>
             </w:r>
           </w:p>
-          <w:p>
+          <w:p ns1:paraId="00000025">
             <w:pPr>
               <w:keepNext w:val="0"/>
               <w:keepLines w:val="0"/>
@@ -2596,7 +2400,7 @@
               <w:t xml:space="preserve">jQuery</w:t>
             </w:r>
           </w:p>
-          <w:p>
+          <w:p ns1:paraId="00000026">
             <w:pPr>
               <w:keepNext w:val="0"/>
               <w:keepLines w:val="0"/>
@@ -2653,7 +2457,7 @@
               <w:t xml:space="preserve">Web driver IO</w:t>
             </w:r>
           </w:p>
-          <w:p>
+          <w:p ns1:paraId="00000027">
             <w:pPr>
               <w:keepNext w:val="0"/>
               <w:keepLines w:val="0"/>
@@ -2710,7 +2514,7 @@
               <w:t xml:space="preserve">CRO Development</w:t>
             </w:r>
           </w:p>
-          <w:p>
+          <w:p ns1:paraId="00000028">
             <w:pPr>
               <w:jc w:val="both"/>
               <w:rPr>
@@ -2728,7 +2532,7 @@
               </w:rPr>
             </w:r>
           </w:p>
-          <w:p>
+          <w:p ns1:paraId="00000029">
             <w:pPr>
               <w:jc w:val="both"/>
               <w:rPr>
@@ -2753,7 +2557,7 @@
               <w:t xml:space="preserve">Markup Language and Style:</w:t>
             </w:r>
           </w:p>
-          <w:p>
+          <w:p ns1:paraId="0000002A">
             <w:pPr>
               <w:keepNext w:val="0"/>
               <w:keepLines w:val="0"/>
@@ -2810,7 +2614,7 @@
               <w:t xml:space="preserve">HTML</w:t>
             </w:r>
           </w:p>
-          <w:p>
+          <w:p ns1:paraId="0000002B">
             <w:pPr>
               <w:keepNext w:val="0"/>
               <w:keepLines w:val="0"/>
@@ -2867,7 +2671,7 @@
               <w:t xml:space="preserve">CSS</w:t>
             </w:r>
           </w:p>
-          <w:p>
+          <w:p ns1:paraId="0000002C">
             <w:pPr>
               <w:keepNext w:val="0"/>
               <w:keepLines w:val="0"/>
@@ -2924,7 +2728,7 @@
               <w:t xml:space="preserve">Sass, Scss</w:t>
             </w:r>
           </w:p>
-          <w:p>
+          <w:p ns1:paraId="0000002D">
             <w:pPr>
               <w:keepNext w:val="0"/>
               <w:keepLines w:val="0"/>
@@ -2981,7 +2785,7 @@
               <w:t xml:space="preserve">JSX</w:t>
             </w:r>
           </w:p>
-          <w:p>
+          <w:p ns1:paraId="0000002E">
             <w:pPr>
               <w:keepNext w:val="0"/>
               <w:keepLines w:val="0"/>
@@ -3038,7 +2842,7 @@
               <w:t xml:space="preserve">XML</w:t>
             </w:r>
           </w:p>
-          <w:p>
+          <w:p ns1:paraId="0000002F">
             <w:pPr>
               <w:keepNext w:val="0"/>
               <w:keepLines w:val="0"/>
@@ -3077,7 +2881,7 @@
               </w:rPr>
             </w:r>
           </w:p>
-          <w:p>
+          <w:p ns1:paraId="00000030">
             <w:pPr>
               <w:jc w:val="both"/>
               <w:rPr>
@@ -3102,7 +2906,7 @@
               <w:t xml:space="preserve">Framework Skills  </w:t>
             </w:r>
           </w:p>
-          <w:p>
+          <w:p ns1:paraId="00000031">
             <w:pPr>
               <w:jc w:val="both"/>
               <w:rPr>
@@ -3151,7 +2955,7 @@
               <w:t xml:space="preserve">):</w:t>
             </w:r>
           </w:p>
-          <w:p>
+          <w:p ns1:paraId="00000032">
             <w:pPr>
               <w:keepNext w:val="0"/>
               <w:keepLines w:val="0"/>
@@ -3208,7 +3012,7 @@
               <w:t xml:space="preserve">React-Native</w:t>
             </w:r>
           </w:p>
-          <w:p>
+          <w:p ns1:paraId="00000033">
             <w:pPr>
               <w:keepNext w:val="0"/>
               <w:keepLines w:val="0"/>
@@ -3265,7 +3069,7 @@
               <w:t xml:space="preserve">Android</w:t>
             </w:r>
           </w:p>
-          <w:p>
+          <w:p ns1:paraId="00000034">
             <w:pPr>
               <w:jc w:val="both"/>
               <w:rPr>
@@ -3286,7 +3090,7 @@
         </w:tc>
         <w:tc>
           <w:tcPr/>
-          <w:p>
+          <w:p ns1:paraId="00000035">
             <w:pPr>
               <w:jc w:val="both"/>
               <w:rPr>
@@ -3311,7 +3115,7 @@
               <w:t xml:space="preserve">Programming Language Skills:</w:t>
             </w:r>
           </w:p>
-          <w:p>
+          <w:p ns1:paraId="00000036">
             <w:pPr>
               <w:keepNext w:val="0"/>
               <w:keepLines w:val="0"/>
@@ -3368,7 +3172,7 @@
               <w:t xml:space="preserve">PHP(OOP)</w:t>
             </w:r>
           </w:p>
-          <w:p>
+          <w:p ns1:paraId="00000037">
             <w:pPr>
               <w:keepNext w:val="0"/>
               <w:keepLines w:val="0"/>
@@ -3425,7 +3229,7 @@
               <w:t xml:space="preserve">JavaScript</w:t>
             </w:r>
           </w:p>
-          <w:p>
+          <w:p ns1:paraId="00000038">
             <w:pPr>
               <w:keepNext w:val="0"/>
               <w:keepLines w:val="0"/>
@@ -3482,7 +3286,7 @@
               <w:t xml:space="preserve">TypeScript</w:t>
             </w:r>
           </w:p>
-          <w:p>
+          <w:p ns1:paraId="00000039">
             <w:pPr>
               <w:keepNext w:val="0"/>
               <w:keepLines w:val="0"/>
@@ -3539,7 +3343,7 @@
               <w:t xml:space="preserve">C#</w:t>
             </w:r>
           </w:p>
-          <w:p>
+          <w:p ns1:paraId="0000003A">
             <w:pPr>
               <w:keepNext w:val="0"/>
               <w:keepLines w:val="0"/>
@@ -3596,7 +3400,7 @@
               <w:t xml:space="preserve">JAVA</w:t>
             </w:r>
           </w:p>
-          <w:p>
+          <w:p ns1:paraId="0000003B">
             <w:pPr>
               <w:keepNext w:val="0"/>
               <w:keepLines w:val="0"/>
@@ -3653,7 +3457,7 @@
               <w:t xml:space="preserve">Python</w:t>
             </w:r>
           </w:p>
-          <w:p>
+          <w:p ns1:paraId="0000003C">
             <w:pPr>
               <w:keepNext w:val="0"/>
               <w:keepLines w:val="0"/>
@@ -3710,7 +3514,7 @@
               <w:t xml:space="preserve">PHP</w:t>
             </w:r>
           </w:p>
-          <w:p>
+          <w:p ns1:paraId="0000003D">
             <w:pPr>
               <w:keepNext w:val="0"/>
               <w:keepLines w:val="0"/>
@@ -3749,7 +3553,7 @@
               </w:rPr>
             </w:r>
           </w:p>
-          <w:p>
+          <w:p ns1:paraId="0000003E">
             <w:pPr>
               <w:rPr>
                 <w:rFonts w:ascii="Arial" w:cs="Arial" w:eastAsia="Arial" w:hAnsi="Arial"/>
@@ -3773,7 +3577,7 @@
               <w:t xml:space="preserve">Database:</w:t>
             </w:r>
           </w:p>
-          <w:p>
+          <w:p ns1:paraId="0000003F">
             <w:pPr>
               <w:keepNext w:val="0"/>
               <w:keepLines w:val="0"/>
@@ -3830,7 +3634,7 @@
               <w:t xml:space="preserve">SQL</w:t>
             </w:r>
           </w:p>
-          <w:p>
+          <w:p ns1:paraId="00000040">
             <w:pPr>
               <w:keepNext w:val="0"/>
               <w:keepLines w:val="0"/>
@@ -3887,7 +3691,7 @@
               <w:t xml:space="preserve">MongoDB</w:t>
             </w:r>
           </w:p>
-          <w:p>
+          <w:p ns1:paraId="00000041">
             <w:pPr>
               <w:rPr>
                 <w:rFonts w:ascii="Arial" w:cs="Arial" w:eastAsia="Arial" w:hAnsi="Arial"/>
@@ -3904,7 +3708,7 @@
               </w:rPr>
             </w:r>
           </w:p>
-          <w:p>
+          <w:p ns1:paraId="00000042">
             <w:pPr>
               <w:rPr>
                 <w:rFonts w:ascii="Arial" w:cs="Arial" w:eastAsia="Arial" w:hAnsi="Arial"/>
@@ -3928,7 +3732,7 @@
               <w:t xml:space="preserve">System Analyzing and Structural Skills:</w:t>
             </w:r>
           </w:p>
-          <w:p>
+          <w:p ns1:paraId="00000043">
             <w:pPr>
               <w:keepNext w:val="0"/>
               <w:keepLines w:val="0"/>
@@ -3985,7 +3789,7 @@
               <w:t xml:space="preserve">Algorithm</w:t>
             </w:r>
           </w:p>
-          <w:p>
+          <w:p ns1:paraId="00000044">
             <w:pPr>
               <w:keepNext w:val="0"/>
               <w:keepLines w:val="0"/>
@@ -4042,7 +3846,7 @@
               <w:t xml:space="preserve">Database</w:t>
             </w:r>
           </w:p>
-          <w:p>
+          <w:p ns1:paraId="00000045">
             <w:pPr>
               <w:keepNext w:val="0"/>
               <w:keepLines w:val="0"/>
@@ -4099,7 +3903,7 @@
               <w:t xml:space="preserve">Data Structure</w:t>
             </w:r>
           </w:p>
-          <w:p>
+          <w:p ns1:paraId="00000046">
             <w:pPr>
               <w:keepNext w:val="0"/>
               <w:keepLines w:val="0"/>
@@ -4156,7 +3960,7 @@
               <w:t xml:space="preserve">System Analysis and Design</w:t>
             </w:r>
           </w:p>
-          <w:p>
+          <w:p ns1:paraId="00000047">
             <w:pPr>
               <w:keepNext w:val="0"/>
               <w:keepLines w:val="0"/>
@@ -4213,7 +4017,7 @@
               <w:t xml:space="preserve">Computer Architecture </w:t>
             </w:r>
           </w:p>
-          <w:p>
+          <w:p ns1:paraId="00000048">
             <w:pPr>
               <w:rPr>
                 <w:rFonts w:ascii="Arial" w:cs="Arial" w:eastAsia="Arial" w:hAnsi="Arial"/>
@@ -4229,7 +4033,7 @@
               </w:rPr>
             </w:r>
           </w:p>
-          <w:p>
+          <w:p ns1:paraId="00000049">
             <w:pPr>
               <w:rPr>
                 <w:rFonts w:ascii="Arial" w:cs="Arial" w:eastAsia="Arial" w:hAnsi="Arial"/>
@@ -4248,7 +4052,7 @@
         </w:tc>
         <w:tc>
           <w:tcPr/>
-          <w:p>
+          <w:p ns1:paraId="0000004A">
             <w:pPr>
               <w:rPr>
                 <w:rFonts w:ascii="Arial" w:cs="Arial" w:eastAsia="Arial" w:hAnsi="Arial"/>
@@ -4274,7 +4078,7 @@
               </w:rPr>
             </w:r>
           </w:p>
-          <w:p>
+          <w:p ns1:paraId="0000004B">
             <w:pPr>
               <w:keepNext w:val="0"/>
               <w:keepLines w:val="0"/>
@@ -4313,7 +4117,7 @@
               </w:rPr>
             </w:r>
           </w:p>
-          <w:p>
+          <w:p ns1:paraId="0000004C">
             <w:pPr>
               <w:keepNext w:val="0"/>
               <w:keepLines w:val="0"/>
@@ -4408,7 +4212,7 @@
               <w:t xml:space="preserve">)</w:t>
             </w:r>
           </w:p>
-          <w:p>
+          <w:p ns1:paraId="0000004D">
             <w:pPr>
               <w:keepNext w:val="0"/>
               <w:keepLines w:val="0"/>
@@ -4503,7 +4307,7 @@
               <w:t xml:space="preserve">)</w:t>
             </w:r>
           </w:p>
-          <w:p>
+          <w:p ns1:paraId="0000004E">
             <w:pPr>
               <w:keepNext w:val="0"/>
               <w:keepLines w:val="0"/>
@@ -4598,7 +4402,7 @@
               <w:t xml:space="preserve">)</w:t>
             </w:r>
           </w:p>
-          <w:p>
+          <w:p ns1:paraId="0000004F">
             <w:pPr>
               <w:keepNext w:val="0"/>
               <w:keepLines w:val="0"/>
@@ -4693,7 +4497,7 @@
               <w:t xml:space="preserve">) </w:t>
             </w:r>
           </w:p>
-          <w:p>
+          <w:p ns1:paraId="00000050">
             <w:pPr>
               <w:keepNext w:val="0"/>
               <w:keepLines w:val="0"/>
@@ -4788,7 +4592,7 @@
               <w:t xml:space="preserve">)</w:t>
             </w:r>
           </w:p>
-          <w:p>
+          <w:p ns1:paraId="00000051">
             <w:pPr>
               <w:jc w:val="both"/>
               <w:rPr>
@@ -4803,7 +4607,7 @@
               </w:rPr>
             </w:r>
           </w:p>
-          <w:p>
+          <w:p ns1:paraId="00000052">
             <w:pPr>
               <w:rPr>
                 <w:rFonts w:ascii="Arial" w:cs="Arial" w:eastAsia="Arial" w:hAnsi="Arial"/>
@@ -4831,7 +4635,7 @@
               </w:rPr>
             </w:r>
           </w:p>
-          <w:p>
+          <w:p ns1:paraId="00000053">
             <w:pPr>
               <w:keepNext w:val="0"/>
               <w:keepLines w:val="0"/>
@@ -4888,7 +4692,7 @@
               <w:t xml:space="preserve">C Panel</w:t>
             </w:r>
           </w:p>
-          <w:p>
+          <w:p ns1:paraId="00000054">
             <w:pPr>
               <w:keepNext w:val="0"/>
               <w:keepLines w:val="0"/>
@@ -4945,7 +4749,7 @@
               <w:t xml:space="preserve">DevOps</w:t>
             </w:r>
           </w:p>
-          <w:p>
+          <w:p ns1:paraId="00000055">
             <w:pPr>
               <w:keepNext w:val="0"/>
               <w:keepLines w:val="0"/>
@@ -5002,7 +4806,7 @@
               <w:t xml:space="preserve">Firebase</w:t>
             </w:r>
           </w:p>
-          <w:p>
+          <w:p ns1:paraId="00000056">
             <w:pPr>
               <w:keepNext w:val="0"/>
               <w:keepLines w:val="0"/>
@@ -5059,7 +4863,7 @@
               <w:t xml:space="preserve">Linux Cloud Server</w:t>
             </w:r>
           </w:p>
-          <w:p>
+          <w:p ns1:paraId="00000057">
             <w:pPr>
               <w:keepNext w:val="0"/>
               <w:keepLines w:val="0"/>
@@ -5116,7 +4920,7 @@
               <w:t xml:space="preserve">Heroku</w:t>
             </w:r>
           </w:p>
-          <w:p>
+          <w:p ns1:paraId="00000058">
             <w:pPr>
               <w:keepNext w:val="0"/>
               <w:keepLines w:val="0"/>
@@ -5155,7 +4959,7 @@
               </w:rPr>
             </w:r>
           </w:p>
-          <w:p>
+          <w:p ns1:paraId="00000059">
             <w:pPr>
               <w:rPr>
                 <w:rFonts w:ascii="Arial" w:cs="Arial" w:eastAsia="Arial" w:hAnsi="Arial"/>
@@ -5179,7 +4983,7 @@
               <w:t xml:space="preserve">Version Controlling:</w:t>
             </w:r>
           </w:p>
-          <w:p>
+          <w:p ns1:paraId="0000005A">
             <w:pPr>
               <w:keepNext w:val="0"/>
               <w:keepLines w:val="0"/>
@@ -5236,7 +5040,7 @@
               <w:t xml:space="preserve">GitHub (git)</w:t>
             </w:r>
           </w:p>
-          <w:p>
+          <w:p ns1:paraId="0000005B">
             <w:pPr>
               <w:keepNext w:val="0"/>
               <w:keepLines w:val="0"/>
@@ -5293,7 +5097,7 @@
               <w:t xml:space="preserve">Bitbucket (git)</w:t>
             </w:r>
           </w:p>
-          <w:p>
+          <w:p ns1:paraId="0000005C">
             <w:pPr>
               <w:keepNext w:val="0"/>
               <w:keepLines w:val="0"/>
@@ -5350,7 +5154,7 @@
               <w:t xml:space="preserve">GitLab</w:t>
             </w:r>
           </w:p>
-          <w:p>
+          <w:p ns1:paraId="0000005D">
             <w:pPr>
               <w:rPr>
                 <w:rFonts w:ascii="Arial" w:cs="Arial" w:eastAsia="Arial" w:hAnsi="Arial"/>
@@ -5378,7 +5182,7 @@
               </w:rPr>
             </w:r>
           </w:p>
-          <w:p>
+          <w:p ns1:paraId="0000005E">
             <w:pPr>
               <w:keepNext w:val="0"/>
               <w:keepLines w:val="0"/>
@@ -5435,7 +5239,7 @@
               <w:t xml:space="preserve">Microsoft Office (word/Excel/PowerPoint) </w:t>
             </w:r>
           </w:p>
-          <w:p>
+          <w:p ns1:paraId="0000005F">
             <w:pPr>
               <w:keepNext w:val="0"/>
               <w:keepLines w:val="0"/>
@@ -5497,7 +5301,7 @@
               </w:rPr>
             </w:r>
           </w:p>
-          <w:p>
+          <w:p ns1:paraId="00000060">
             <w:pPr>
               <w:keepNext w:val="0"/>
               <w:keepLines w:val="0"/>
@@ -5559,7 +5363,7 @@
               </w:rPr>
             </w:r>
           </w:p>
-          <w:p>
+          <w:p ns1:paraId="00000061">
             <w:pPr>
               <w:keepNext w:val="0"/>
               <w:keepLines w:val="0"/>
@@ -5621,7 +5425,7 @@
               </w:rPr>
             </w:r>
           </w:p>
-          <w:p>
+          <w:p ns1:paraId="00000062">
             <w:pPr>
               <w:keepNext w:val="0"/>
               <w:keepLines w:val="0"/>
@@ -5660,7 +5464,7 @@
               </w:rPr>
             </w:r>
           </w:p>
-          <w:p>
+          <w:p ns1:paraId="00000063">
             <w:pPr>
               <w:jc w:val="both"/>
               <w:rPr>
@@ -5678,7 +5482,7 @@
         </w:tc>
       </w:tr>
     </w:tbl>
-    <w:p>
+    <w:p ns1:paraId="00000064">
       <w:pPr>
         <w:rPr>
           <w:rFonts w:ascii="Arial" w:cs="Arial" w:eastAsia="Arial" w:hAnsi="Arial"/>
@@ -5690,67 +5494,67 @@
         </w:rPr>
       </w:r>
     </w:p>
-    <w:p>
-      <w:pPr>
-        <w:rPr>
-          <w:rFonts w:ascii="Arial" w:cs="Arial" w:eastAsia="Arial" w:hAnsi="Arial"/>
-          <w:sz w:val="20"/>
-          <w:szCs w:val="20"/>
-        </w:rPr>
-      </w:pPr>
-      <w:r>
-        <w:rPr>
-          <w:rtl w:val="0"/>
-        </w:rPr>
-      </w:r>
-      <w:r>
-        <mc:AlternateContent>
-          <mc:Choice Requires="wpg">
+    <w:p ns1:paraId="00000065">
+      <w:pPr>
+        <w:rPr>
+          <w:rFonts w:ascii="Arial" w:cs="Arial" w:eastAsia="Arial" w:hAnsi="Arial"/>
+          <w:sz w:val="20"/>
+          <w:szCs w:val="20"/>
+        </w:rPr>
+      </w:pPr>
+      <w:r>
+        <w:rPr>
+          <w:rtl w:val="0"/>
+        </w:rPr>
+      </w:r>
+      <w:r>
+        <ns6:AlternateContent>
+          <ns6:Choice Requires="wpg">
             <w:drawing>
-              <wp:anchor allowOverlap="1" behindDoc="0" distB="45720" distT="45720" distL="114300" distR="114300" hidden="0" layoutInCell="1" locked="0" relativeHeight="0" simplePos="0">
-                <wp:simplePos x="0" y="0"/>
-                <wp:positionH relativeFrom="column">
-                  <wp:posOffset>1</wp:posOffset>
-                </wp:positionH>
-                <wp:positionV relativeFrom="paragraph">
-                  <wp:posOffset>45720</wp:posOffset>
-                </wp:positionV>
-                <wp:extent cx="5928995" cy="302895"/>
-                <wp:effectExtent b="0" l="0" r="0" t="0"/>
-                <wp:wrapSquare wrapText="bothSides" distB="45720" distT="45720" distL="114300" distR="114300"/>
-                <wp:docPr id="1" name=""/>
-                <a:graphic>
-                  <a:graphicData uri="http://schemas.microsoft.com/office/word/2010/wordprocessingShape">
-                    <wps:wsp>
-                      <wps:cNvSpPr/>
-                      <wps:cNvPr id="2" name="Shape 2"/>
-                      <wps:spPr>
-                        <a:xfrm>
-                          <a:off x="2386265" y="3633315"/>
-                          <a:ext cx="5919470" cy="293370"/>
-                        </a:xfrm>
-                        <a:prstGeom prst="rect">
-                          <a:avLst/>
-                        </a:prstGeom>
-                        <a:gradFill>
-                          <a:gsLst>
-                            <a:gs pos="0">
-                              <a:srgbClr val="70A5DA"/>
-                            </a:gs>
-                            <a:gs pos="50000">
-                              <a:srgbClr val="539BDB"/>
-                            </a:gs>
-                            <a:gs pos="100000">
-                              <a:srgbClr val="4288C8"/>
-                            </a:gs>
-                          </a:gsLst>
-                          <a:lin ang="5400000" scaled="0"/>
-                        </a:gradFill>
-                        <a:ln>
-                          <a:noFill/>
-                        </a:ln>
-                      </wps:spPr>
-                      <wps:txbx>
+              <ns2:anchor allowOverlap="1" behindDoc="0" distB="45720" distT="45720" distL="114300" distR="114300" hidden="0" layoutInCell="1" locked="0" relativeHeight="0" simplePos="0">
+                <ns2:simplePos x="0" y="0"/>
+                <ns2:positionH relativeFrom="column">
+                  <ns2:posOffset>1</ns2:posOffset>
+                </ns2:positionH>
+                <ns2:positionV relativeFrom="paragraph">
+                  <ns2:posOffset>45720</ns2:posOffset>
+                </ns2:positionV>
+                <ns2:extent cx="5928995" cy="302895"/>
+                <ns2:effectExtent b="0" l="0" r="0" t="0"/>
+                <ns2:wrapSquare wrapText="bothSides" distB="45720" distT="45720" distL="114300" distR="114300"/>
+                <ns2:docPr id="1" name=""/>
+                <ns3:graphic>
+                  <ns3:graphicData uri="http://schemas.microsoft.com/office/word/2010/wordprocessingShape">
+                    <ns7:wsp>
+                      <ns7:cNvSpPr/>
+                      <ns7:cNvPr id="2" name="Shape 2"/>
+                      <ns7:spPr>
+                        <ns3:xfrm>
+                          <ns3:off x="2386265" y="3633315"/>
+                          <ns3:ext cx="5919470" cy="293370"/>
+                        </ns3:xfrm>
+                        <ns3:prstGeom prst="rect">
+                          <ns3:avLst/>
+                        </ns3:prstGeom>
+                        <ns3:gradFill>
+                          <ns3:gsLst>
+                            <ns3:gs pos="0">
+                              <ns3:srgbClr val="70A5DA"/>
+                            </ns3:gs>
+                            <ns3:gs pos="50000">
+                              <ns3:srgbClr val="539BDB"/>
+                            </ns3:gs>
+                            <ns3:gs pos="100000">
+                              <ns3:srgbClr val="4288C8"/>
+                            </ns3:gs>
+                          </ns3:gsLst>
+                          <ns3:lin ang="5400000" scaled="0"/>
+                        </ns3:gradFill>
+                        <ns3:ln>
+                          <ns3:noFill/>
+                        </ns3:ln>
+                      </ns7:spPr>
+                      <ns7:txbx>
                         <w:txbxContent>
                           <w:p>
                             <w:pPr>
@@ -5774,62 +5578,62 @@
                             </w:r>
                           </w:p>
                         </w:txbxContent>
-                      </wps:txbx>
-                      <wps:bodyPr anchorCtr="0" anchor="t" bIns="45700" lIns="91425" spcFirstLastPara="1" rIns="91425" wrap="square" tIns="45700">
-                        <a:noAutofit/>
-                      </wps:bodyPr>
-                    </wps:wsp>
-                  </a:graphicData>
-                </a:graphic>
-              </wp:anchor>
+                      </ns7:txbx>
+                      <ns7:bodyPr anchorCtr="0" anchor="t" bIns="45700" lIns="91425" spcFirstLastPara="1" rIns="91425" wrap="square" tIns="45700">
+                        <ns3:noAutofit/>
+                      </ns7:bodyPr>
+                    </ns7:wsp>
+                  </ns3:graphicData>
+                </ns3:graphic>
+              </ns2:anchor>
             </w:drawing>
-          </mc:Choice>
-          <mc:Fallback>
+          </ns6:Choice>
+          <ns6:Fallback>
             <w:drawing>
-              <wp:anchor allowOverlap="1" behindDoc="0" distB="45720" distT="45720" distL="114300" distR="114300" hidden="0" layoutInCell="1" locked="0" relativeHeight="0" simplePos="0">
-                <wp:simplePos x="0" y="0"/>
-                <wp:positionH relativeFrom="column">
-                  <wp:posOffset>1</wp:posOffset>
-                </wp:positionH>
-                <wp:positionV relativeFrom="paragraph">
-                  <wp:posOffset>45720</wp:posOffset>
-                </wp:positionV>
-                <wp:extent cx="5928995" cy="302895"/>
-                <wp:effectExtent b="0" l="0" r="0" t="0"/>
-                <wp:wrapSquare wrapText="bothSides" distB="45720" distT="45720" distL="114300" distR="114300"/>
-                <wp:docPr id="1" name="image8.png"/>
-                <a:graphic>
-                  <a:graphicData uri="http://schemas.openxmlformats.org/drawingml/2006/picture">
-                    <pic:pic>
-                      <pic:nvPicPr>
-                        <pic:cNvPr id="0" name="image8.png"/>
-                        <pic:cNvPicPr preferRelativeResize="0"/>
-                      </pic:nvPicPr>
-                      <pic:blipFill>
-                        <a:blip r:embed="rId13"/>
-                        <a:srcRect/>
-                        <a:stretch>
-                          <a:fillRect/>
-                        </a:stretch>
-                      </pic:blipFill>
-                      <pic:spPr>
-                        <a:xfrm>
-                          <a:off x="0" y="0"/>
-                          <a:ext cx="5928995" cy="302895"/>
-                        </a:xfrm>
-                        <a:prstGeom prst="rect"/>
-                        <a:ln/>
-                      </pic:spPr>
-                    </pic:pic>
-                  </a:graphicData>
-                </a:graphic>
-              </wp:anchor>
+              <ns2:anchor allowOverlap="1" behindDoc="0" distB="45720" distT="45720" distL="114300" distR="114300" hidden="0" layoutInCell="1" locked="0" relativeHeight="0" simplePos="0">
+                <ns2:simplePos x="0" y="0"/>
+                <ns2:positionH relativeFrom="column">
+                  <ns2:posOffset>1</ns2:posOffset>
+                </ns2:positionH>
+                <ns2:positionV relativeFrom="paragraph">
+                  <ns2:posOffset>45720</ns2:posOffset>
+                </ns2:positionV>
+                <ns2:extent cx="5928995" cy="302895"/>
+                <ns2:effectExtent b="0" l="0" r="0" t="0"/>
+                <ns2:wrapSquare wrapText="bothSides" distB="45720" distT="45720" distL="114300" distR="114300"/>
+                <ns2:docPr id="1" name="image8.png"/>
+                <ns3:graphic>
+                  <ns3:graphicData uri="http://schemas.openxmlformats.org/drawingml/2006/picture">
+                    <ns4:pic>
+                      <ns4:nvPicPr>
+                        <ns4:cNvPr id="0" name="image8.png"/>
+                        <ns4:cNvPicPr preferRelativeResize="0"/>
+                      </ns4:nvPicPr>
+                      <ns4:blipFill>
+                        <ns3:blip ns5:embed="rId13"/>
+                        <ns3:srcRect/>
+                        <ns3:stretch>
+                          <ns3:fillRect/>
+                        </ns3:stretch>
+                      </ns4:blipFill>
+                      <ns4:spPr>
+                        <ns3:xfrm>
+                          <ns3:off x="0" y="0"/>
+                          <ns3:ext cx="5928995" cy="302895"/>
+                        </ns3:xfrm>
+                        <ns3:prstGeom prst="rect"/>
+                        <ns3:ln/>
+                      </ns4:spPr>
+                    </ns4:pic>
+                  </ns3:graphicData>
+                </ns3:graphic>
+              </ns2:anchor>
             </w:drawing>
-          </mc:Fallback>
-        </mc:AlternateContent>
+          </ns6:Fallback>
+        </ns6:AlternateContent>
       </w:r>
     </w:p>
-    <w:p>
+    <w:p ns1:paraId="00000066">
       <w:pPr>
         <w:keepNext w:val="0"/>
         <w:keepLines w:val="0"/>
@@ -5866,7 +5670,7 @@
           <w:vertAlign w:val="baseline"/>
         </w:rPr>
       </w:pPr>
-      <w:hyperlink r:id="rId14">
+      <w:hyperlink ns5:id="rId14">
         <w:r>
           <w:rPr>
             <w:rFonts w:ascii="Calibri" w:cs="Calibri" w:eastAsia="Calibri" w:hAnsi="Calibri"/>
@@ -5969,7 +5773,7 @@
         <w:t xml:space="preserve">)</w:t>
       </w:r>
     </w:p>
-    <w:p>
+    <w:p ns1:paraId="00000067">
       <w:pPr>
         <w:keepNext w:val="0"/>
         <w:keepLines w:val="0"/>
@@ -6006,7 +5810,7 @@
           <w:vertAlign w:val="baseline"/>
         </w:rPr>
       </w:pPr>
-      <w:hyperlink r:id="rId15">
+      <w:hyperlink ns5:id="rId15">
         <w:r>
           <w:rPr>
             <w:rFonts w:ascii="Calibri" w:cs="Calibri" w:eastAsia="Calibri" w:hAnsi="Calibri"/>
@@ -6108,7 +5912,7 @@
         <w:t xml:space="preserve">)</w:t>
       </w:r>
     </w:p>
-    <w:p>
+    <w:p ns1:paraId="00000068">
       <w:pPr>
         <w:keepNext w:val="0"/>
         <w:keepLines w:val="0"/>
@@ -6145,7 +5949,7 @@
           <w:vertAlign w:val="baseline"/>
         </w:rPr>
       </w:pPr>
-      <w:hyperlink r:id="rId16">
+      <w:hyperlink ns5:id="rId16">
         <w:r>
           <w:rPr>
             <w:rFonts w:ascii="Calibri" w:cs="Calibri" w:eastAsia="Calibri" w:hAnsi="Calibri"/>
@@ -6224,7 +6028,7 @@
         <w:t xml:space="preserve">)</w:t>
       </w:r>
     </w:p>
-    <w:p>
+    <w:p ns1:paraId="00000069">
       <w:pPr>
         <w:keepNext w:val="0"/>
         <w:keepLines w:val="0"/>
@@ -6261,7 +6065,7 @@
           <w:vertAlign w:val="baseline"/>
         </w:rPr>
       </w:pPr>
-      <w:hyperlink r:id="rId17">
+      <w:hyperlink ns5:id="rId17">
         <w:r>
           <w:rPr>
             <w:rFonts w:ascii="Arial" w:cs="Arial" w:eastAsia="Arial" w:hAnsi="Arial"/>
@@ -6348,7 +6152,7 @@
         <w:t xml:space="preserve">)</w:t>
       </w:r>
     </w:p>
-    <w:p>
+    <w:p ns1:paraId="0000006A">
       <w:pPr>
         <w:keepNext w:val="0"/>
         <w:keepLines w:val="0"/>
@@ -6385,7 +6189,7 @@
           <w:vertAlign w:val="baseline"/>
         </w:rPr>
       </w:pPr>
-      <w:hyperlink r:id="rId18">
+      <w:hyperlink ns5:id="rId18">
         <w:r>
           <w:rPr>
             <w:rFonts w:ascii="Calibri" w:cs="Calibri" w:eastAsia="Calibri" w:hAnsi="Calibri"/>
@@ -6486,7 +6290,7 @@
         <w:t xml:space="preserve">)</w:t>
       </w:r>
     </w:p>
-    <w:p>
+    <w:p ns1:paraId="0000006B">
       <w:pPr>
         <w:keepNext w:val="0"/>
         <w:keepLines w:val="0"/>
@@ -6583,7 +6387,7 @@
         <w:t xml:space="preserve">)</w:t>
       </w:r>
     </w:p>
-    <w:p>
+    <w:p ns1:paraId="0000006C">
       <w:pPr>
         <w:keepNext w:val="0"/>
         <w:keepLines w:val="0"/>
@@ -6616,7 +6420,7 @@
           <w:vertAlign w:val="baseline"/>
         </w:rPr>
       </w:pPr>
-      <w:hyperlink r:id="rId19">
+      <w:hyperlink ns5:id="rId19">
         <w:r>
           <w:rPr>
             <w:rFonts w:ascii="Calibri" w:cs="Calibri" w:eastAsia="Calibri" w:hAnsi="Calibri"/>
@@ -6702,7 +6506,7 @@
         <w:t xml:space="preserve">)</w:t>
       </w:r>
     </w:p>
-    <w:p>
+    <w:p ns1:paraId="0000006D">
       <w:pPr>
         <w:keepNext w:val="0"/>
         <w:keepLines w:val="0"/>
@@ -6805,7 +6609,7 @@
         <w:t xml:space="preserve">)</w:t>
       </w:r>
     </w:p>
-    <w:p>
+    <w:p ns1:paraId="0000006E">
       <w:pPr>
         <w:keepNext w:val="0"/>
         <w:keepLines w:val="0"/>
@@ -6838,7 +6642,7 @@
           <w:vertAlign w:val="baseline"/>
         </w:rPr>
       </w:pPr>
-      <w:hyperlink r:id="rId20">
+      <w:hyperlink ns5:id="rId20">
         <w:r>
           <w:rPr>
             <w:rFonts w:ascii="Calibri" w:cs="Calibri" w:eastAsia="Calibri" w:hAnsi="Calibri"/>
@@ -6884,7 +6688,7 @@
         </w:rPr>
       </w:r>
     </w:p>
-    <w:p>
+    <w:p ns1:paraId="0000006F">
       <w:pPr>
         <w:keepNext w:val="0"/>
         <w:keepLines w:val="0"/>
@@ -6941,7 +6745,7 @@
         <w:t xml:space="preserve">Online blog using Laravel, HTML, CSS, JavaScript, PHP and SQL.</w:t>
       </w:r>
     </w:p>
-    <w:p>
+    <w:p ns1:paraId="00000070">
       <w:pPr>
         <w:keepNext w:val="0"/>
         <w:keepLines w:val="0"/>
@@ -6974,7 +6778,7 @@
           <w:vertAlign w:val="baseline"/>
         </w:rPr>
       </w:pPr>
-      <w:hyperlink r:id="rId21">
+      <w:hyperlink ns5:id="rId21">
         <w:r>
           <w:rPr>
             <w:rFonts w:ascii="Calibri" w:cs="Calibri" w:eastAsia="Calibri" w:hAnsi="Calibri"/>
@@ -7001,7 +6805,7 @@
         </w:rPr>
       </w:r>
     </w:p>
-    <w:p>
+    <w:p ns1:paraId="00000071">
       <w:pPr>
         <w:keepNext w:val="0"/>
         <w:keepLines w:val="0"/>
@@ -7058,7 +6862,7 @@
         <w:t xml:space="preserve">Online Diary using Laravel, HTML, CSS, JavaScript, PHP, SQL, AngularJS, Ajax</w:t>
       </w:r>
     </w:p>
-    <w:p>
+    <w:p ns1:paraId="00000072">
       <w:pPr>
         <w:keepNext w:val="0"/>
         <w:keepLines w:val="0"/>
@@ -7091,7 +6895,7 @@
           <w:vertAlign w:val="baseline"/>
         </w:rPr>
       </w:pPr>
-      <w:hyperlink r:id="rId22">
+      <w:hyperlink ns5:id="rId22">
         <w:r>
           <w:rPr>
             <w:rFonts w:ascii="Calibri" w:cs="Calibri" w:eastAsia="Calibri" w:hAnsi="Calibri"/>
@@ -7118,7 +6922,7 @@
         </w:rPr>
       </w:r>
     </w:p>
-    <w:p>
+    <w:p ns1:paraId="00000073">
       <w:pPr>
         <w:keepNext w:val="0"/>
         <w:keepLines w:val="0"/>
@@ -7157,7 +6961,7 @@
         </w:rPr>
       </w:r>
     </w:p>
-    <w:p>
+    <w:p ns1:paraId="00000074">
       <w:pPr>
         <w:keepNext w:val="0"/>
         <w:keepLines w:val="0"/>
@@ -7252,7 +7056,7 @@
         <w:t xml:space="preserve">)</w:t>
       </w:r>
     </w:p>
-    <w:p>
+    <w:p ns1:paraId="00000075">
       <w:pPr>
         <w:keepNext w:val="0"/>
         <w:keepLines w:val="0"/>
@@ -7285,7 +7089,7 @@
           <w:vertAlign w:val="baseline"/>
         </w:rPr>
       </w:pPr>
-      <w:hyperlink r:id="rId23">
+      <w:hyperlink ns5:id="rId23">
         <w:r>
           <w:rPr>
             <w:rFonts w:ascii="Calibri" w:cs="Calibri" w:eastAsia="Calibri" w:hAnsi="Calibri"/>
@@ -7312,7 +7116,7 @@
         </w:rPr>
       </w:r>
     </w:p>
-    <w:p>
+    <w:p ns1:paraId="00000076">
       <w:pPr>
         <w:keepNext w:val="0"/>
         <w:keepLines w:val="0"/>
@@ -7369,7 +7173,7 @@
         <w:t xml:space="preserve">Hangman Game (console) using C programming</w:t>
       </w:r>
     </w:p>
-    <w:p>
+    <w:p ns1:paraId="00000077">
       <w:pPr>
         <w:keepNext w:val="0"/>
         <w:keepLines w:val="0"/>
@@ -7406,7 +7210,7 @@
           <w:vertAlign w:val="baseline"/>
         </w:rPr>
       </w:pPr>
-      <w:hyperlink r:id="rId24">
+      <w:hyperlink ns5:id="rId24">
         <w:r>
           <w:rPr>
             <w:rFonts w:ascii="Calibri" w:cs="Calibri" w:eastAsia="Calibri" w:hAnsi="Calibri"/>
@@ -7433,7 +7237,7 @@
         </w:rPr>
       </w:r>
     </w:p>
-    <w:p>
+    <w:p ns1:paraId="00000078">
       <w:pPr>
         <w:keepNext w:val="0"/>
         <w:keepLines w:val="0"/>
@@ -7490,7 +7294,7 @@
         <w:t xml:space="preserve">Online Shop Management System using HTML, CSS, JavaScript, PHP and SQL. (Under Web Programming Course)</w:t>
       </w:r>
     </w:p>
-    <w:p>
+    <w:p ns1:paraId="00000079">
       <w:pPr>
         <w:keepNext w:val="0"/>
         <w:keepLines w:val="0"/>
@@ -7547,7 +7351,7 @@
         <w:t xml:space="preserve">Online Shop Management System using Java and SQL. (Under OOP Course)</w:t>
       </w:r>
     </w:p>
-    <w:p>
+    <w:p ns1:paraId="0000007A">
       <w:pPr>
         <w:keepNext w:val="0"/>
         <w:keepLines w:val="0"/>
@@ -7604,7 +7408,7 @@
         <w:t xml:space="preserve">Online Shop Management System using C# and .NET (Under Database Management System Course)</w:t>
       </w:r>
     </w:p>
-    <w:p>
+    <w:p ns1:paraId="0000007B">
       <w:pPr>
         <w:keepNext w:val="0"/>
         <w:keepLines w:val="0"/>
@@ -7643,67 +7447,67 @@
         </w:rPr>
       </w:r>
     </w:p>
-    <w:p>
-      <w:pPr>
-        <w:rPr>
-          <w:rFonts w:ascii="Arial" w:cs="Arial" w:eastAsia="Arial" w:hAnsi="Arial"/>
-          <w:sz w:val="20"/>
-          <w:szCs w:val="20"/>
-        </w:rPr>
-      </w:pPr>
-      <w:r>
-        <w:rPr>
-          <w:rtl w:val="0"/>
-        </w:rPr>
-      </w:r>
-      <w:r>
-        <mc:AlternateContent>
-          <mc:Choice Requires="wpg">
+    <w:p ns1:paraId="0000007C">
+      <w:pPr>
+        <w:rPr>
+          <w:rFonts w:ascii="Arial" w:cs="Arial" w:eastAsia="Arial" w:hAnsi="Arial"/>
+          <w:sz w:val="20"/>
+          <w:szCs w:val="20"/>
+        </w:rPr>
+      </w:pPr>
+      <w:r>
+        <w:rPr>
+          <w:rtl w:val="0"/>
+        </w:rPr>
+      </w:r>
+      <w:r>
+        <ns6:AlternateContent>
+          <ns6:Choice Requires="wpg">
             <w:drawing>
-              <wp:anchor allowOverlap="1" behindDoc="0" distB="45720" distT="45720" distL="114300" distR="114300" hidden="0" layoutInCell="1" locked="0" relativeHeight="0" simplePos="0">
-                <wp:simplePos x="0" y="0"/>
-                <wp:positionH relativeFrom="column">
-                  <wp:posOffset>1</wp:posOffset>
-                </wp:positionH>
-                <wp:positionV relativeFrom="paragraph">
-                  <wp:posOffset>287020</wp:posOffset>
-                </wp:positionV>
-                <wp:extent cx="5928995" cy="302895"/>
-                <wp:effectExtent b="0" l="0" r="0" t="0"/>
-                <wp:wrapSquare wrapText="bothSides" distB="45720" distT="45720" distL="114300" distR="114300"/>
-                <wp:docPr id="4" name=""/>
-                <a:graphic>
-                  <a:graphicData uri="http://schemas.microsoft.com/office/word/2010/wordprocessingShape">
-                    <wps:wsp>
-                      <wps:cNvSpPr/>
-                      <wps:cNvPr id="5" name="Shape 5"/>
-                      <wps:spPr>
-                        <a:xfrm>
-                          <a:off x="2386265" y="3633315"/>
-                          <a:ext cx="5919470" cy="293370"/>
-                        </a:xfrm>
-                        <a:prstGeom prst="rect">
-                          <a:avLst/>
-                        </a:prstGeom>
-                        <a:gradFill>
-                          <a:gsLst>
-                            <a:gs pos="0">
-                              <a:srgbClr val="70A5DA"/>
-                            </a:gs>
-                            <a:gs pos="50000">
-                              <a:srgbClr val="539BDB"/>
-                            </a:gs>
-                            <a:gs pos="100000">
-                              <a:srgbClr val="4288C8"/>
-                            </a:gs>
-                          </a:gsLst>
-                          <a:lin ang="5400000" scaled="0"/>
-                        </a:gradFill>
-                        <a:ln>
-                          <a:noFill/>
-                        </a:ln>
-                      </wps:spPr>
-                      <wps:txbx>
+              <ns2:anchor allowOverlap="1" behindDoc="0" distB="45720" distT="45720" distL="114300" distR="114300" hidden="0" layoutInCell="1" locked="0" relativeHeight="0" simplePos="0">
+                <ns2:simplePos x="0" y="0"/>
+                <ns2:positionH relativeFrom="column">
+                  <ns2:posOffset>1</ns2:posOffset>
+                </ns2:positionH>
+                <ns2:positionV relativeFrom="paragraph">
+                  <ns2:posOffset>287020</ns2:posOffset>
+                </ns2:positionV>
+                <ns2:extent cx="5928995" cy="302895"/>
+                <ns2:effectExtent b="0" l="0" r="0" t="0"/>
+                <ns2:wrapSquare wrapText="bothSides" distB="45720" distT="45720" distL="114300" distR="114300"/>
+                <ns2:docPr id="4" name=""/>
+                <ns3:graphic>
+                  <ns3:graphicData uri="http://schemas.microsoft.com/office/word/2010/wordprocessingShape">
+                    <ns7:wsp>
+                      <ns7:cNvSpPr/>
+                      <ns7:cNvPr id="5" name="Shape 5"/>
+                      <ns7:spPr>
+                        <ns3:xfrm>
+                          <ns3:off x="2386265" y="3633315"/>
+                          <ns3:ext cx="5919470" cy="293370"/>
+                        </ns3:xfrm>
+                        <ns3:prstGeom prst="rect">
+                          <ns3:avLst/>
+                        </ns3:prstGeom>
+                        <ns3:gradFill>
+                          <ns3:gsLst>
+                            <ns3:gs pos="0">
+                              <ns3:srgbClr val="70A5DA"/>
+                            </ns3:gs>
+                            <ns3:gs pos="50000">
+                              <ns3:srgbClr val="539BDB"/>
+                            </ns3:gs>
+                            <ns3:gs pos="100000">
+                              <ns3:srgbClr val="4288C8"/>
+                            </ns3:gs>
+                          </ns3:gsLst>
+                          <ns3:lin ang="5400000" scaled="0"/>
+                        </ns3:gradFill>
+                        <ns3:ln>
+                          <ns3:noFill/>
+                        </ns3:ln>
+                      </ns7:spPr>
+                      <ns7:txbx>
                         <w:txbxContent>
                           <w:p>
                             <w:pPr>
@@ -7727,62 +7531,62 @@
                             </w:r>
                           </w:p>
                         </w:txbxContent>
-                      </wps:txbx>
-                      <wps:bodyPr anchorCtr="0" anchor="t" bIns="45700" lIns="91425" spcFirstLastPara="1" rIns="91425" wrap="square" tIns="45700">
-                        <a:noAutofit/>
-                      </wps:bodyPr>
-                    </wps:wsp>
-                  </a:graphicData>
-                </a:graphic>
-              </wp:anchor>
+                      </ns7:txbx>
+                      <ns7:bodyPr anchorCtr="0" anchor="t" bIns="45700" lIns="91425" spcFirstLastPara="1" rIns="91425" wrap="square" tIns="45700">
+                        <ns3:noAutofit/>
+                      </ns7:bodyPr>
+                    </ns7:wsp>
+                  </ns3:graphicData>
+                </ns3:graphic>
+              </ns2:anchor>
             </w:drawing>
-          </mc:Choice>
-          <mc:Fallback>
+          </ns6:Choice>
+          <ns6:Fallback>
             <w:drawing>
-              <wp:anchor allowOverlap="1" behindDoc="0" distB="45720" distT="45720" distL="114300" distR="114300" hidden="0" layoutInCell="1" locked="0" relativeHeight="0" simplePos="0">
-                <wp:simplePos x="0" y="0"/>
-                <wp:positionH relativeFrom="column">
-                  <wp:posOffset>1</wp:posOffset>
-                </wp:positionH>
-                <wp:positionV relativeFrom="paragraph">
-                  <wp:posOffset>287020</wp:posOffset>
-                </wp:positionV>
-                <wp:extent cx="5928995" cy="302895"/>
-                <wp:effectExtent b="0" l="0" r="0" t="0"/>
-                <wp:wrapSquare wrapText="bothSides" distB="45720" distT="45720" distL="114300" distR="114300"/>
-                <wp:docPr id="4" name="image11.png"/>
-                <a:graphic>
-                  <a:graphicData uri="http://schemas.openxmlformats.org/drawingml/2006/picture">
-                    <pic:pic>
-                      <pic:nvPicPr>
-                        <pic:cNvPr id="0" name="image11.png"/>
-                        <pic:cNvPicPr preferRelativeResize="0"/>
-                      </pic:nvPicPr>
-                      <pic:blipFill>
-                        <a:blip r:embed="rId13"/>
-                        <a:srcRect/>
-                        <a:stretch>
-                          <a:fillRect/>
-                        </a:stretch>
-                      </pic:blipFill>
-                      <pic:spPr>
-                        <a:xfrm>
-                          <a:off x="0" y="0"/>
-                          <a:ext cx="5928995" cy="302895"/>
-                        </a:xfrm>
-                        <a:prstGeom prst="rect"/>
-                        <a:ln/>
-                      </pic:spPr>
-                    </pic:pic>
-                  </a:graphicData>
-                </a:graphic>
-              </wp:anchor>
+              <ns2:anchor allowOverlap="1" behindDoc="0" distB="45720" distT="45720" distL="114300" distR="114300" hidden="0" layoutInCell="1" locked="0" relativeHeight="0" simplePos="0">
+                <ns2:simplePos x="0" y="0"/>
+                <ns2:positionH relativeFrom="column">
+                  <ns2:posOffset>1</ns2:posOffset>
+                </ns2:positionH>
+                <ns2:positionV relativeFrom="paragraph">
+                  <ns2:posOffset>287020</ns2:posOffset>
+                </ns2:positionV>
+                <ns2:extent cx="5928995" cy="302895"/>
+                <ns2:effectExtent b="0" l="0" r="0" t="0"/>
+                <ns2:wrapSquare wrapText="bothSides" distB="45720" distT="45720" distL="114300" distR="114300"/>
+                <ns2:docPr id="4" name="image11.png"/>
+                <ns3:graphic>
+                  <ns3:graphicData uri="http://schemas.openxmlformats.org/drawingml/2006/picture">
+                    <ns4:pic>
+                      <ns4:nvPicPr>
+                        <ns4:cNvPr id="0" name="image11.png"/>
+                        <ns4:cNvPicPr preferRelativeResize="0"/>
+                      </ns4:nvPicPr>
+                      <ns4:blipFill>
+                        <ns3:blip ns5:embed="rId13"/>
+                        <ns3:srcRect/>
+                        <ns3:stretch>
+                          <ns3:fillRect/>
+                        </ns3:stretch>
+                      </ns4:blipFill>
+                      <ns4:spPr>
+                        <ns3:xfrm>
+                          <ns3:off x="0" y="0"/>
+                          <ns3:ext cx="5928995" cy="302895"/>
+                        </ns3:xfrm>
+                        <ns3:prstGeom prst="rect"/>
+                        <ns3:ln/>
+                      </ns4:spPr>
+                    </ns4:pic>
+                  </ns3:graphicData>
+                </ns3:graphic>
+              </ns2:anchor>
             </w:drawing>
-          </mc:Fallback>
-        </mc:AlternateContent>
+          </ns6:Fallback>
+        </ns6:AlternateContent>
       </w:r>
     </w:p>
-    <w:p>
+    <w:p ns1:paraId="0000007D">
       <w:pPr>
         <w:keepNext w:val="0"/>
         <w:keepLines w:val="0"/>
@@ -7839,7 +7643,7 @@
         <w:t xml:space="preserve">Individual programming contest champion 2015, CSE department</w:t>
       </w:r>
     </w:p>
-    <w:p>
+    <w:p ns1:paraId="0000007E">
       <w:pPr>
         <w:keepNext w:val="0"/>
         <w:keepLines w:val="0"/>
@@ -7896,7 +7700,7 @@
         <w:t xml:space="preserve">Top CGPA Achiever 2015, we shine brighter</w:t>
       </w:r>
     </w:p>
-    <w:p>
+    <w:p ns1:paraId="0000007F">
       <w:pPr>
         <w:keepNext w:val="0"/>
         <w:keepLines w:val="0"/>
@@ -7953,7 +7757,7 @@
         <w:t xml:space="preserve">Second Runner-up CSE Fest Programming Contest 2016, Diu CPC</w:t>
       </w:r>
     </w:p>
-    <w:p>
+    <w:p ns1:paraId="00000080">
       <w:pPr>
         <w:keepNext w:val="0"/>
         <w:keepLines w:val="0"/>
@@ -8010,7 +7814,7 @@
         <w:t xml:space="preserve">Runner up, iGenius 2014, Grameenphone </w:t>
       </w:r>
     </w:p>
-    <w:p>
+    <w:p ns1:paraId="00000081">
       <w:pPr>
         <w:keepNext w:val="0"/>
         <w:keepLines w:val="0"/>
@@ -8067,7 +7871,7 @@
         <w:t xml:space="preserve">Reception for Excellent result, Prothom Alo, 2012 </w:t>
       </w:r>
     </w:p>
-    <w:p>
+    <w:p ns1:paraId="00000082">
       <w:pPr>
         <w:rPr>
           <w:rFonts w:ascii="Arial" w:cs="Arial" w:eastAsia="Arial" w:hAnsi="Arial"/>
@@ -8082,67 +7886,67 @@
         </w:rPr>
       </w:r>
     </w:p>
-    <w:p>
-      <w:pPr>
-        <w:rPr>
-          <w:rFonts w:ascii="Arial" w:cs="Arial" w:eastAsia="Arial" w:hAnsi="Arial"/>
-          <w:sz w:val="20"/>
-          <w:szCs w:val="20"/>
-        </w:rPr>
-      </w:pPr>
-      <w:r>
-        <w:rPr>
-          <w:rtl w:val="0"/>
-        </w:rPr>
-      </w:r>
-      <w:r>
-        <mc:AlternateContent>
-          <mc:Choice Requires="wpg">
+    <w:p ns1:paraId="00000083">
+      <w:pPr>
+        <w:rPr>
+          <w:rFonts w:ascii="Arial" w:cs="Arial" w:eastAsia="Arial" w:hAnsi="Arial"/>
+          <w:sz w:val="20"/>
+          <w:szCs w:val="20"/>
+        </w:rPr>
+      </w:pPr>
+      <w:r>
+        <w:rPr>
+          <w:rtl w:val="0"/>
+        </w:rPr>
+      </w:r>
+      <w:r>
+        <ns6:AlternateContent>
+          <ns6:Choice Requires="wpg">
             <w:drawing>
-              <wp:anchor allowOverlap="1" behindDoc="0" distB="45720" distT="45720" distL="114300" distR="114300" hidden="0" layoutInCell="1" locked="0" relativeHeight="0" simplePos="0">
-                <wp:simplePos x="0" y="0"/>
-                <wp:positionH relativeFrom="column">
-                  <wp:posOffset>25401</wp:posOffset>
-                </wp:positionH>
-                <wp:positionV relativeFrom="paragraph">
-                  <wp:posOffset>210820</wp:posOffset>
-                </wp:positionV>
-                <wp:extent cx="5928995" cy="302895"/>
-                <wp:effectExtent b="0" l="0" r="0" t="0"/>
-                <wp:wrapSquare wrapText="bothSides" distB="45720" distT="45720" distL="114300" distR="114300"/>
-                <wp:docPr id="5" name=""/>
-                <a:graphic>
-                  <a:graphicData uri="http://schemas.microsoft.com/office/word/2010/wordprocessingShape">
-                    <wps:wsp>
-                      <wps:cNvSpPr/>
-                      <wps:cNvPr id="6" name="Shape 6"/>
-                      <wps:spPr>
-                        <a:xfrm>
-                          <a:off x="2386265" y="3633315"/>
-                          <a:ext cx="5919470" cy="293370"/>
-                        </a:xfrm>
-                        <a:prstGeom prst="rect">
-                          <a:avLst/>
-                        </a:prstGeom>
-                        <a:gradFill>
-                          <a:gsLst>
-                            <a:gs pos="0">
-                              <a:srgbClr val="70A5DA"/>
-                            </a:gs>
-                            <a:gs pos="50000">
-                              <a:srgbClr val="539BDB"/>
-                            </a:gs>
-                            <a:gs pos="100000">
-                              <a:srgbClr val="4288C8"/>
-                            </a:gs>
-                          </a:gsLst>
-                          <a:lin ang="5400000" scaled="0"/>
-                        </a:gradFill>
-                        <a:ln>
-                          <a:noFill/>
-                        </a:ln>
-                      </wps:spPr>
-                      <wps:txbx>
+              <ns2:anchor allowOverlap="1" behindDoc="0" distB="45720" distT="45720" distL="114300" distR="114300" hidden="0" layoutInCell="1" locked="0" relativeHeight="0" simplePos="0">
+                <ns2:simplePos x="0" y="0"/>
+                <ns2:positionH relativeFrom="column">
+                  <ns2:posOffset>25401</ns2:posOffset>
+                </ns2:positionH>
+                <ns2:positionV relativeFrom="paragraph">
+                  <ns2:posOffset>210820</ns2:posOffset>
+                </ns2:positionV>
+                <ns2:extent cx="5928995" cy="302895"/>
+                <ns2:effectExtent b="0" l="0" r="0" t="0"/>
+                <ns2:wrapSquare wrapText="bothSides" distB="45720" distT="45720" distL="114300" distR="114300"/>
+                <ns2:docPr id="5" name=""/>
+                <ns3:graphic>
+                  <ns3:graphicData uri="http://schemas.microsoft.com/office/word/2010/wordprocessingShape">
+                    <ns7:wsp>
+                      <ns7:cNvSpPr/>
+                      <ns7:cNvPr id="6" name="Shape 6"/>
+                      <ns7:spPr>
+                        <ns3:xfrm>
+                          <ns3:off x="2386265" y="3633315"/>
+                          <ns3:ext cx="5919470" cy="293370"/>
+                        </ns3:xfrm>
+                        <ns3:prstGeom prst="rect">
+                          <ns3:avLst/>
+                        </ns3:prstGeom>
+                        <ns3:gradFill>
+                          <ns3:gsLst>
+                            <ns3:gs pos="0">
+                              <ns3:srgbClr val="70A5DA"/>
+                            </ns3:gs>
+                            <ns3:gs pos="50000">
+                              <ns3:srgbClr val="539BDB"/>
+                            </ns3:gs>
+                            <ns3:gs pos="100000">
+                              <ns3:srgbClr val="4288C8"/>
+                            </ns3:gs>
+                          </ns3:gsLst>
+                          <ns3:lin ang="5400000" scaled="0"/>
+                        </ns3:gradFill>
+                        <ns3:ln>
+                          <ns3:noFill/>
+                        </ns3:ln>
+                      </ns7:spPr>
+                      <ns7:txbx>
                         <w:txbxContent>
                           <w:p>
                             <w:pPr>
@@ -8166,62 +7970,62 @@
                             </w:r>
                           </w:p>
                         </w:txbxContent>
-                      </wps:txbx>
-                      <wps:bodyPr anchorCtr="0" anchor="t" bIns="45700" lIns="91425" spcFirstLastPara="1" rIns="91425" wrap="square" tIns="45700">
-                        <a:noAutofit/>
-                      </wps:bodyPr>
-                    </wps:wsp>
-                  </a:graphicData>
-                </a:graphic>
-              </wp:anchor>
+                      </ns7:txbx>
+                      <ns7:bodyPr anchorCtr="0" anchor="t" bIns="45700" lIns="91425" spcFirstLastPara="1" rIns="91425" wrap="square" tIns="45700">
+                        <ns3:noAutofit/>
+                      </ns7:bodyPr>
+                    </ns7:wsp>
+                  </ns3:graphicData>
+                </ns3:graphic>
+              </ns2:anchor>
             </w:drawing>
-          </mc:Choice>
-          <mc:Fallback>
+          </ns6:Choice>
+          <ns6:Fallback>
             <w:drawing>
-              <wp:anchor allowOverlap="1" behindDoc="0" distB="45720" distT="45720" distL="114300" distR="114300" hidden="0" layoutInCell="1" locked="0" relativeHeight="0" simplePos="0">
-                <wp:simplePos x="0" y="0"/>
-                <wp:positionH relativeFrom="column">
-                  <wp:posOffset>25401</wp:posOffset>
-                </wp:positionH>
-                <wp:positionV relativeFrom="paragraph">
-                  <wp:posOffset>210820</wp:posOffset>
-                </wp:positionV>
-                <wp:extent cx="5928995" cy="302895"/>
-                <wp:effectExtent b="0" l="0" r="0" t="0"/>
-                <wp:wrapSquare wrapText="bothSides" distB="45720" distT="45720" distL="114300" distR="114300"/>
-                <wp:docPr id="5" name="image12.png"/>
-                <a:graphic>
-                  <a:graphicData uri="http://schemas.openxmlformats.org/drawingml/2006/picture">
-                    <pic:pic>
-                      <pic:nvPicPr>
-                        <pic:cNvPr id="0" name="image12.png"/>
-                        <pic:cNvPicPr preferRelativeResize="0"/>
-                      </pic:nvPicPr>
-                      <pic:blipFill>
-                        <a:blip r:embed="rId13"/>
-                        <a:srcRect/>
-                        <a:stretch>
-                          <a:fillRect/>
-                        </a:stretch>
-                      </pic:blipFill>
-                      <pic:spPr>
-                        <a:xfrm>
-                          <a:off x="0" y="0"/>
-                          <a:ext cx="5928995" cy="302895"/>
-                        </a:xfrm>
-                        <a:prstGeom prst="rect"/>
-                        <a:ln/>
-                      </pic:spPr>
-                    </pic:pic>
-                  </a:graphicData>
-                </a:graphic>
-              </wp:anchor>
+              <ns2:anchor allowOverlap="1" behindDoc="0" distB="45720" distT="45720" distL="114300" distR="114300" hidden="0" layoutInCell="1" locked="0" relativeHeight="0" simplePos="0">
+                <ns2:simplePos x="0" y="0"/>
+                <ns2:positionH relativeFrom="column">
+                  <ns2:posOffset>25401</ns2:posOffset>
+                </ns2:positionH>
+                <ns2:positionV relativeFrom="paragraph">
+                  <ns2:posOffset>210820</ns2:posOffset>
+                </ns2:positionV>
+                <ns2:extent cx="5928995" cy="302895"/>
+                <ns2:effectExtent b="0" l="0" r="0" t="0"/>
+                <ns2:wrapSquare wrapText="bothSides" distB="45720" distT="45720" distL="114300" distR="114300"/>
+                <ns2:docPr id="5" name="image12.png"/>
+                <ns3:graphic>
+                  <ns3:graphicData uri="http://schemas.openxmlformats.org/drawingml/2006/picture">
+                    <ns4:pic>
+                      <ns4:nvPicPr>
+                        <ns4:cNvPr id="0" name="image12.png"/>
+                        <ns4:cNvPicPr preferRelativeResize="0"/>
+                      </ns4:nvPicPr>
+                      <ns4:blipFill>
+                        <ns3:blip ns5:embed="rId13"/>
+                        <ns3:srcRect/>
+                        <ns3:stretch>
+                          <ns3:fillRect/>
+                        </ns3:stretch>
+                      </ns4:blipFill>
+                      <ns4:spPr>
+                        <ns3:xfrm>
+                          <ns3:off x="0" y="0"/>
+                          <ns3:ext cx="5928995" cy="302895"/>
+                        </ns3:xfrm>
+                        <ns3:prstGeom prst="rect"/>
+                        <ns3:ln/>
+                      </ns4:spPr>
+                    </ns4:pic>
+                  </ns3:graphicData>
+                </ns3:graphic>
+              </ns2:anchor>
             </w:drawing>
-          </mc:Fallback>
-        </mc:AlternateContent>
+          </ns6:Fallback>
+        </ns6:AlternateContent>
       </w:r>
     </w:p>
-    <w:p>
+    <w:p ns1:paraId="00000084">
       <w:pPr>
         <w:keepNext w:val="0"/>
         <w:keepLines w:val="0"/>
@@ -8281,7 +8085,7 @@
         <w:t xml:space="preserve">: Mother Tongue</w:t>
       </w:r>
     </w:p>
-    <w:p>
+    <w:p ns1:paraId="00000085">
       <w:pPr>
         <w:keepNext w:val="0"/>
         <w:keepLines w:val="0"/>
@@ -8369,7 +8173,7 @@
         <w:t xml:space="preserve"> and presentation Skill </w:t>
       </w:r>
     </w:p>
-    <w:p>
+    <w:p ns1:paraId="00000086">
       <w:pPr>
         <w:keepNext w:val="0"/>
         <w:keepLines w:val="0"/>
@@ -8408,7 +8212,7 @@
         </w:rPr>
       </w:r>
     </w:p>
-    <w:p>
+    <w:p ns1:paraId="00000087">
       <w:pPr>
         <w:rPr>
           <w:rFonts w:ascii="Arial" w:cs="Arial" w:eastAsia="Arial" w:hAnsi="Arial"/>
@@ -8423,67 +8227,67 @@
         </w:rPr>
       </w:r>
     </w:p>
-    <w:p>
-      <w:pPr>
-        <w:rPr>
-          <w:rFonts w:ascii="Arial" w:cs="Arial" w:eastAsia="Arial" w:hAnsi="Arial"/>
-          <w:sz w:val="20"/>
-          <w:szCs w:val="20"/>
-        </w:rPr>
-      </w:pPr>
-      <w:r>
-        <w:rPr>
-          <w:rtl w:val="0"/>
-        </w:rPr>
-      </w:r>
-      <w:r>
-        <mc:AlternateContent>
-          <mc:Choice Requires="wpg">
+    <w:p ns1:paraId="00000088">
+      <w:pPr>
+        <w:rPr>
+          <w:rFonts w:ascii="Arial" w:cs="Arial" w:eastAsia="Arial" w:hAnsi="Arial"/>
+          <w:sz w:val="20"/>
+          <w:szCs w:val="20"/>
+        </w:rPr>
+      </w:pPr>
+      <w:r>
+        <w:rPr>
+          <w:rtl w:val="0"/>
+        </w:rPr>
+      </w:r>
+      <w:r>
+        <ns6:AlternateContent>
+          <ns6:Choice Requires="wpg">
             <w:drawing>
-              <wp:anchor allowOverlap="1" behindDoc="0" distB="45720" distT="45720" distL="114300" distR="114300" hidden="0" layoutInCell="1" locked="0" relativeHeight="0" simplePos="0">
-                <wp:simplePos x="0" y="0"/>
-                <wp:positionH relativeFrom="column">
-                  <wp:posOffset>25401</wp:posOffset>
-                </wp:positionH>
-                <wp:positionV relativeFrom="paragraph">
-                  <wp:posOffset>210820</wp:posOffset>
-                </wp:positionV>
-                <wp:extent cx="5928995" cy="302895"/>
-                <wp:effectExtent b="0" l="0" r="0" t="0"/>
-                <wp:wrapSquare wrapText="bothSides" distB="45720" distT="45720" distL="114300" distR="114300"/>
-                <wp:docPr id="6" name=""/>
-                <a:graphic>
-                  <a:graphicData uri="http://schemas.microsoft.com/office/word/2010/wordprocessingShape">
-                    <wps:wsp>
-                      <wps:cNvSpPr/>
-                      <wps:cNvPr id="7" name="Shape 7"/>
-                      <wps:spPr>
-                        <a:xfrm>
-                          <a:off x="2386265" y="3633315"/>
-                          <a:ext cx="5919470" cy="293370"/>
-                        </a:xfrm>
-                        <a:prstGeom prst="rect">
-                          <a:avLst/>
-                        </a:prstGeom>
-                        <a:gradFill>
-                          <a:gsLst>
-                            <a:gs pos="0">
-                              <a:srgbClr val="70A5DA"/>
-                            </a:gs>
-                            <a:gs pos="50000">
-                              <a:srgbClr val="539BDB"/>
-                            </a:gs>
-                            <a:gs pos="100000">
-                              <a:srgbClr val="4288C8"/>
-                            </a:gs>
-                          </a:gsLst>
-                          <a:lin ang="5400000" scaled="0"/>
-                        </a:gradFill>
-                        <a:ln>
-                          <a:noFill/>
-                        </a:ln>
-                      </wps:spPr>
-                      <wps:txbx>
+              <ns2:anchor allowOverlap="1" behindDoc="0" distB="45720" distT="45720" distL="114300" distR="114300" hidden="0" layoutInCell="1" locked="0" relativeHeight="0" simplePos="0">
+                <ns2:simplePos x="0" y="0"/>
+                <ns2:positionH relativeFrom="column">
+                  <ns2:posOffset>25401</ns2:posOffset>
+                </ns2:positionH>
+                <ns2:positionV relativeFrom="paragraph">
+                  <ns2:posOffset>210820</ns2:posOffset>
+                </ns2:positionV>
+                <ns2:extent cx="5928995" cy="302895"/>
+                <ns2:effectExtent b="0" l="0" r="0" t="0"/>
+                <ns2:wrapSquare wrapText="bothSides" distB="45720" distT="45720" distL="114300" distR="114300"/>
+                <ns2:docPr id="6" name=""/>
+                <ns3:graphic>
+                  <ns3:graphicData uri="http://schemas.microsoft.com/office/word/2010/wordprocessingShape">
+                    <ns7:wsp>
+                      <ns7:cNvSpPr/>
+                      <ns7:cNvPr id="7" name="Shape 7"/>
+                      <ns7:spPr>
+                        <ns3:xfrm>
+                          <ns3:off x="2386265" y="3633315"/>
+                          <ns3:ext cx="5919470" cy="293370"/>
+                        </ns3:xfrm>
+                        <ns3:prstGeom prst="rect">
+                          <ns3:avLst/>
+                        </ns3:prstGeom>
+                        <ns3:gradFill>
+                          <ns3:gsLst>
+                            <ns3:gs pos="0">
+                              <ns3:srgbClr val="70A5DA"/>
+                            </ns3:gs>
+                            <ns3:gs pos="50000">
+                              <ns3:srgbClr val="539BDB"/>
+                            </ns3:gs>
+                            <ns3:gs pos="100000">
+                              <ns3:srgbClr val="4288C8"/>
+                            </ns3:gs>
+                          </ns3:gsLst>
+                          <ns3:lin ang="5400000" scaled="0"/>
+                        </ns3:gradFill>
+                        <ns3:ln>
+                          <ns3:noFill/>
+                        </ns3:ln>
+                      </ns7:spPr>
+                      <ns7:txbx>
                         <w:txbxContent>
                           <w:p>
                             <w:pPr>
@@ -8507,62 +8311,62 @@
                             </w:r>
                           </w:p>
                         </w:txbxContent>
-                      </wps:txbx>
-                      <wps:bodyPr anchorCtr="0" anchor="t" bIns="45700" lIns="91425" spcFirstLastPara="1" rIns="91425" wrap="square" tIns="45700">
-                        <a:noAutofit/>
-                      </wps:bodyPr>
-                    </wps:wsp>
-                  </a:graphicData>
-                </a:graphic>
-              </wp:anchor>
+                      </ns7:txbx>
+                      <ns7:bodyPr anchorCtr="0" anchor="t" bIns="45700" lIns="91425" spcFirstLastPara="1" rIns="91425" wrap="square" tIns="45700">
+                        <ns3:noAutofit/>
+                      </ns7:bodyPr>
+                    </ns7:wsp>
+                  </ns3:graphicData>
+                </ns3:graphic>
+              </ns2:anchor>
             </w:drawing>
-          </mc:Choice>
-          <mc:Fallback>
+          </ns6:Choice>
+          <ns6:Fallback>
             <w:drawing>
-              <wp:anchor allowOverlap="1" behindDoc="0" distB="45720" distT="45720" distL="114300" distR="114300" hidden="0" layoutInCell="1" locked="0" relativeHeight="0" simplePos="0">
-                <wp:simplePos x="0" y="0"/>
-                <wp:positionH relativeFrom="column">
-                  <wp:posOffset>25401</wp:posOffset>
-                </wp:positionH>
-                <wp:positionV relativeFrom="paragraph">
-                  <wp:posOffset>210820</wp:posOffset>
-                </wp:positionV>
-                <wp:extent cx="5928995" cy="302895"/>
-                <wp:effectExtent b="0" l="0" r="0" t="0"/>
-                <wp:wrapSquare wrapText="bothSides" distB="45720" distT="45720" distL="114300" distR="114300"/>
-                <wp:docPr id="6" name="image13.png"/>
-                <a:graphic>
-                  <a:graphicData uri="http://schemas.openxmlformats.org/drawingml/2006/picture">
-                    <pic:pic>
-                      <pic:nvPicPr>
-                        <pic:cNvPr id="0" name="image13.png"/>
-                        <pic:cNvPicPr preferRelativeResize="0"/>
-                      </pic:nvPicPr>
-                      <pic:blipFill>
-                        <a:blip r:embed="rId13"/>
-                        <a:srcRect/>
-                        <a:stretch>
-                          <a:fillRect/>
-                        </a:stretch>
-                      </pic:blipFill>
-                      <pic:spPr>
-                        <a:xfrm>
-                          <a:off x="0" y="0"/>
-                          <a:ext cx="5928995" cy="302895"/>
-                        </a:xfrm>
-                        <a:prstGeom prst="rect"/>
-                        <a:ln/>
-                      </pic:spPr>
-                    </pic:pic>
-                  </a:graphicData>
-                </a:graphic>
-              </wp:anchor>
+              <ns2:anchor allowOverlap="1" behindDoc="0" distB="45720" distT="45720" distL="114300" distR="114300" hidden="0" layoutInCell="1" locked="0" relativeHeight="0" simplePos="0">
+                <ns2:simplePos x="0" y="0"/>
+                <ns2:positionH relativeFrom="column">
+                  <ns2:posOffset>25401</ns2:posOffset>
+                </ns2:positionH>
+                <ns2:positionV relativeFrom="paragraph">
+                  <ns2:posOffset>210820</ns2:posOffset>
+                </ns2:positionV>
+                <ns2:extent cx="5928995" cy="302895"/>
+                <ns2:effectExtent b="0" l="0" r="0" t="0"/>
+                <ns2:wrapSquare wrapText="bothSides" distB="45720" distT="45720" distL="114300" distR="114300"/>
+                <ns2:docPr id="6" name="image13.png"/>
+                <ns3:graphic>
+                  <ns3:graphicData uri="http://schemas.openxmlformats.org/drawingml/2006/picture">
+                    <ns4:pic>
+                      <ns4:nvPicPr>
+                        <ns4:cNvPr id="0" name="image13.png"/>
+                        <ns4:cNvPicPr preferRelativeResize="0"/>
+                      </ns4:nvPicPr>
+                      <ns4:blipFill>
+                        <ns3:blip ns5:embed="rId13"/>
+                        <ns3:srcRect/>
+                        <ns3:stretch>
+                          <ns3:fillRect/>
+                        </ns3:stretch>
+                      </ns4:blipFill>
+                      <ns4:spPr>
+                        <ns3:xfrm>
+                          <ns3:off x="0" y="0"/>
+                          <ns3:ext cx="5928995" cy="302895"/>
+                        </ns3:xfrm>
+                        <ns3:prstGeom prst="rect"/>
+                        <ns3:ln/>
+                      </ns4:spPr>
+                    </ns4:pic>
+                  </ns3:graphicData>
+                </ns3:graphic>
+              </ns2:anchor>
             </w:drawing>
-          </mc:Fallback>
-        </mc:AlternateContent>
+          </ns6:Fallback>
+        </ns6:AlternateContent>
       </w:r>
     </w:p>
-    <w:p>
+    <w:p ns1:paraId="00000089">
       <w:pPr>
         <w:keepNext w:val="0"/>
         <w:keepLines w:val="0"/>
@@ -8619,7 +8423,7 @@
         <w:t xml:space="preserve">YouTubing (Making Programming Videos on YouTube)</w:t>
       </w:r>
     </w:p>
-    <w:p>
+    <w:p ns1:paraId="0000008A">
       <w:pPr>
         <w:keepNext w:val="0"/>
         <w:keepLines w:val="0"/>
@@ -8676,7 +8480,7 @@
         <w:t xml:space="preserve">Teaching Programming in online Classes</w:t>
       </w:r>
     </w:p>
-    <w:p>
+    <w:p ns1:paraId="0000008B">
       <w:pPr>
         <w:keepNext w:val="0"/>
         <w:keepLines w:val="0"/>
@@ -8733,7 +8537,7 @@
         <w:t xml:space="preserve">Gaming </w:t>
       </w:r>
     </w:p>
-    <w:p>
+    <w:p ns1:paraId="0000008C">
       <w:pPr>
         <w:keepNext w:val="0"/>
         <w:keepLines w:val="0"/>
@@ -8790,7 +8594,7 @@
         <w:t xml:space="preserve">Watching Movies</w:t>
       </w:r>
     </w:p>
-    <w:p>
+    <w:p ns1:paraId="0000008D">
       <w:pPr>
         <w:keepNext w:val="0"/>
         <w:keepLines w:val="0"/>
@@ -8888,7 +8692,7 @@
       </w:r>
     </w:p>
     <w:sectPr>
-      <w:footerReference r:id="rId25" w:type="default"/>
+      <w:footerReference ns5:id="rId25" w:type="default"/>
       <w:pgSz w:h="15840" w:w="12240" w:orient="portrait"/>
       <w:pgMar w:bottom="1440" w:top="1440" w:left="1440" w:right="1440" w:header="720" w:footer="720"/>
       <w:pgNumType w:start="1"/>

</xml_diff>